<commit_message>
Add the lot flow and architecture drawings to the design docs.
Co-authored-by: Cursor <cursoragent@cursor.com>
</commit_message>
<xml_diff>
--- a/docs/agriChain Solution Blueprint.docx
+++ b/docs/agriChain Solution Blueprint.docx
@@ -356,6 +356,20 @@
           <w:sz w:val="22"/>
         </w:rPr>
         <w:t>Authorization</w:t>
+      </w:r>
+    </w:p>
+    <w:p>
+      <w:pPr>
+        <w:spacing w:before="120" w:after="20" w:line="259" w:lineRule="auto"/>
+      </w:pPr>
+      <w:r>
+        <w:rPr>
+          <w:rFonts w:ascii="Calibri" w:hAnsi="Calibri"/>
+          <w:b/>
+          <w:color w:val="143228"/>
+          <w:sz w:val="24"/>
+        </w:rPr>
+        <w:t>Kernel and configuration</w:t>
       </w:r>
     </w:p>
     <w:p>
@@ -557,7 +571,7 @@
           <w:p>
             <w:pPr>
               <w:pStyle w:val="Compact"/>
-              <w:spacing w:before="0" w:after="0" w:line="259" w:lineRule="auto"/>
+              <w:spacing w:before="0" w:after="0"/>
             </w:pPr>
             <w:r>
               <w:rPr>
@@ -589,7 +603,7 @@
           <w:p>
             <w:pPr>
               <w:pStyle w:val="Compact"/>
-              <w:spacing w:before="0" w:after="0" w:line="259" w:lineRule="auto"/>
+              <w:spacing w:before="0" w:after="0"/>
             </w:pPr>
             <w:r>
               <w:rPr>
@@ -623,7 +637,7 @@
           <w:p>
             <w:pPr>
               <w:pStyle w:val="Compact"/>
-              <w:spacing w:before="0" w:after="0" w:line="259" w:lineRule="auto"/>
+              <w:spacing w:before="0" w:after="0"/>
             </w:pPr>
             <w:r>
               <w:rPr>
@@ -655,7 +669,7 @@
           <w:p>
             <w:pPr>
               <w:pStyle w:val="Compact"/>
-              <w:spacing w:before="0" w:after="0" w:line="259" w:lineRule="auto"/>
+              <w:spacing w:before="0" w:after="0"/>
             </w:pPr>
             <w:r>
               <w:rPr>
@@ -689,7 +703,7 @@
           <w:p>
             <w:pPr>
               <w:pStyle w:val="Compact"/>
-              <w:spacing w:before="0" w:after="0" w:line="259" w:lineRule="auto"/>
+              <w:spacing w:before="0" w:after="0"/>
             </w:pPr>
             <w:r>
               <w:rPr>
@@ -721,7 +735,7 @@
           <w:p>
             <w:pPr>
               <w:pStyle w:val="Compact"/>
-              <w:spacing w:before="0" w:after="0" w:line="259" w:lineRule="auto"/>
+              <w:spacing w:before="0" w:after="0"/>
             </w:pPr>
             <w:r>
               <w:rPr>
@@ -755,7 +769,7 @@
           <w:p>
             <w:pPr>
               <w:pStyle w:val="Compact"/>
-              <w:spacing w:before="0" w:after="0" w:line="259" w:lineRule="auto"/>
+              <w:spacing w:before="0" w:after="0"/>
             </w:pPr>
             <w:r>
               <w:rPr>
@@ -787,7 +801,7 @@
           <w:p>
             <w:pPr>
               <w:pStyle w:val="Compact"/>
-              <w:spacing w:before="0" w:after="0" w:line="259" w:lineRule="auto"/>
+              <w:spacing w:before="0" w:after="0"/>
             </w:pPr>
             <w:r>
               <w:rPr>
@@ -821,7 +835,7 @@
           <w:p>
             <w:pPr>
               <w:pStyle w:val="Compact"/>
-              <w:spacing w:before="0" w:after="0" w:line="259" w:lineRule="auto"/>
+              <w:spacing w:before="0" w:after="0"/>
             </w:pPr>
             <w:r>
               <w:rPr>
@@ -853,7 +867,7 @@
           <w:p>
             <w:pPr>
               <w:pStyle w:val="Compact"/>
-              <w:spacing w:before="0" w:after="0" w:line="259" w:lineRule="auto"/>
+              <w:spacing w:before="0" w:after="0"/>
             </w:pPr>
             <w:r>
               <w:rPr>
@@ -887,7 +901,7 @@
           <w:p>
             <w:pPr>
               <w:pStyle w:val="Compact"/>
-              <w:spacing w:before="0" w:after="0" w:line="259" w:lineRule="auto"/>
+              <w:spacing w:before="0" w:after="0"/>
             </w:pPr>
             <w:r>
               <w:rPr>
@@ -919,7 +933,7 @@
           <w:p>
             <w:pPr>
               <w:pStyle w:val="Compact"/>
-              <w:spacing w:before="0" w:after="0" w:line="259" w:lineRule="auto"/>
+              <w:spacing w:before="0" w:after="0"/>
             </w:pPr>
             <w:r>
               <w:rPr>
@@ -943,7 +957,7 @@
       </w:r>
     </w:p>
     <w:bookmarkEnd w:id="9"/>
-    <w:bookmarkStart w:id="13" w:name="solution-blueprint"/>
+    <w:bookmarkStart w:id="19" w:name="solution-blueprint"/>
     <w:p>
       <w:pPr>
         <w:pStyle w:val="Heading1"/>
@@ -1004,7 +1018,7 @@
           <w:p>
             <w:pPr>
               <w:pStyle w:val="Compact"/>
-              <w:spacing w:before="0" w:after="0" w:line="259" w:lineRule="auto"/>
+              <w:spacing w:before="0" w:after="0"/>
             </w:pPr>
             <w:r>
               <w:rPr>
@@ -1036,7 +1050,7 @@
           <w:p>
             <w:pPr>
               <w:pStyle w:val="Compact"/>
-              <w:spacing w:before="0" w:after="0" w:line="259" w:lineRule="auto"/>
+              <w:spacing w:before="0" w:after="0"/>
             </w:pPr>
             <w:r>
               <w:rPr>
@@ -1068,7 +1082,7 @@
           <w:p>
             <w:pPr>
               <w:pStyle w:val="Compact"/>
-              <w:spacing w:before="0" w:after="0" w:line="259" w:lineRule="auto"/>
+              <w:spacing w:before="0" w:after="0"/>
             </w:pPr>
             <w:r>
               <w:rPr>
@@ -1102,7 +1116,7 @@
           <w:p>
             <w:pPr>
               <w:pStyle w:val="Compact"/>
-              <w:spacing w:before="0" w:after="0" w:line="259" w:lineRule="auto"/>
+              <w:spacing w:before="0" w:after="0"/>
             </w:pPr>
             <w:r>
               <w:rPr>
@@ -1134,7 +1148,7 @@
           <w:p>
             <w:pPr>
               <w:pStyle w:val="Compact"/>
-              <w:spacing w:before="0" w:after="0" w:line="259" w:lineRule="auto"/>
+              <w:spacing w:before="0" w:after="0"/>
             </w:pPr>
             <w:r>
               <w:rPr>
@@ -1166,7 +1180,7 @@
           <w:p>
             <w:pPr>
               <w:pStyle w:val="Compact"/>
-              <w:spacing w:before="0" w:after="0" w:line="259" w:lineRule="auto"/>
+              <w:spacing w:before="0" w:after="0"/>
             </w:pPr>
             <w:r>
               <w:rPr>
@@ -1200,7 +1214,7 @@
           <w:p>
             <w:pPr>
               <w:pStyle w:val="Compact"/>
-              <w:spacing w:before="0" w:after="0" w:line="259" w:lineRule="auto"/>
+              <w:spacing w:before="0" w:after="0"/>
             </w:pPr>
             <w:r>
               <w:rPr>
@@ -1232,7 +1246,7 @@
           <w:p>
             <w:pPr>
               <w:pStyle w:val="Compact"/>
-              <w:spacing w:before="0" w:after="0" w:line="259" w:lineRule="auto"/>
+              <w:spacing w:before="0" w:after="0"/>
             </w:pPr>
             <w:r>
               <w:rPr>
@@ -1264,7 +1278,7 @@
           <w:p>
             <w:pPr>
               <w:pStyle w:val="Compact"/>
-              <w:spacing w:before="0" w:after="0" w:line="259" w:lineRule="auto"/>
+              <w:spacing w:before="0" w:after="0"/>
             </w:pPr>
             <w:r>
               <w:rPr>
@@ -1298,7 +1312,7 @@
           <w:p>
             <w:pPr>
               <w:pStyle w:val="Compact"/>
-              <w:spacing w:before="0" w:after="0" w:line="259" w:lineRule="auto"/>
+              <w:spacing w:before="0" w:after="0"/>
             </w:pPr>
             <w:r>
               <w:rPr>
@@ -1330,7 +1344,7 @@
           <w:p>
             <w:pPr>
               <w:pStyle w:val="Compact"/>
-              <w:spacing w:before="0" w:after="0" w:line="259" w:lineRule="auto"/>
+              <w:spacing w:before="0" w:after="0"/>
             </w:pPr>
             <w:r>
               <w:rPr>
@@ -1362,7 +1376,7 @@
           <w:p>
             <w:pPr>
               <w:pStyle w:val="Compact"/>
-              <w:spacing w:before="0" w:after="0" w:line="259" w:lineRule="auto"/>
+              <w:spacing w:before="0" w:after="0"/>
             </w:pPr>
             <w:r>
               <w:rPr>
@@ -1396,7 +1410,7 @@
           <w:p>
             <w:pPr>
               <w:pStyle w:val="Compact"/>
-              <w:spacing w:before="0" w:after="0" w:line="259" w:lineRule="auto"/>
+              <w:spacing w:before="0" w:after="0"/>
             </w:pPr>
             <w:r>
               <w:rPr>
@@ -1428,7 +1442,7 @@
           <w:p>
             <w:pPr>
               <w:pStyle w:val="Compact"/>
-              <w:spacing w:before="0" w:after="0" w:line="259" w:lineRule="auto"/>
+              <w:spacing w:before="0" w:after="0"/>
             </w:pPr>
             <w:r>
               <w:rPr>
@@ -1460,7 +1474,7 @@
           <w:p>
             <w:pPr>
               <w:pStyle w:val="Compact"/>
-              <w:spacing w:before="0" w:after="0" w:line="259" w:lineRule="auto"/>
+              <w:spacing w:before="0" w:after="0"/>
             </w:pPr>
             <w:r>
               <w:rPr>
@@ -1494,7 +1508,7 @@
           <w:p>
             <w:pPr>
               <w:pStyle w:val="Compact"/>
-              <w:spacing w:before="0" w:after="0" w:line="259" w:lineRule="auto"/>
+              <w:spacing w:before="0" w:after="0"/>
             </w:pPr>
             <w:r>
               <w:rPr>
@@ -1526,7 +1540,7 @@
           <w:p>
             <w:pPr>
               <w:pStyle w:val="Compact"/>
-              <w:spacing w:before="0" w:after="0" w:line="259" w:lineRule="auto"/>
+              <w:spacing w:before="0" w:after="0"/>
             </w:pPr>
             <w:r>
               <w:rPr>
@@ -1558,7 +1572,7 @@
           <w:p>
             <w:pPr>
               <w:pStyle w:val="Compact"/>
-              <w:spacing w:before="0" w:after="0" w:line="259" w:lineRule="auto"/>
+              <w:spacing w:before="0" w:after="0"/>
             </w:pPr>
             <w:r>
               <w:rPr>
@@ -1592,7 +1606,7 @@
           <w:p>
             <w:pPr>
               <w:pStyle w:val="Compact"/>
-              <w:spacing w:before="0" w:after="0" w:line="259" w:lineRule="auto"/>
+              <w:spacing w:before="0" w:after="0"/>
             </w:pPr>
             <w:r>
               <w:rPr>
@@ -1624,7 +1638,7 @@
           <w:p>
             <w:pPr>
               <w:pStyle w:val="Compact"/>
-              <w:spacing w:before="0" w:after="0" w:line="259" w:lineRule="auto"/>
+              <w:spacing w:before="0" w:after="0"/>
             </w:pPr>
             <w:r>
               <w:rPr>
@@ -1656,7 +1670,7 @@
           <w:p>
             <w:pPr>
               <w:pStyle w:val="Compact"/>
-              <w:spacing w:before="0" w:after="0" w:line="259" w:lineRule="auto"/>
+              <w:spacing w:before="0" w:after="0"/>
             </w:pPr>
             <w:r>
               <w:rPr>
@@ -1690,7 +1704,7 @@
           <w:p>
             <w:pPr>
               <w:pStyle w:val="Compact"/>
-              <w:spacing w:before="0" w:after="0" w:line="259" w:lineRule="auto"/>
+              <w:spacing w:before="0" w:after="0"/>
             </w:pPr>
             <w:r>
               <w:rPr>
@@ -1722,7 +1736,7 @@
           <w:p>
             <w:pPr>
               <w:pStyle w:val="Compact"/>
-              <w:spacing w:before="0" w:after="0" w:line="259" w:lineRule="auto"/>
+              <w:spacing w:before="0" w:after="0"/>
             </w:pPr>
             <w:r>
               <w:rPr>
@@ -1754,7 +1768,7 @@
           <w:p>
             <w:pPr>
               <w:pStyle w:val="Compact"/>
-              <w:spacing w:before="0" w:after="0" w:line="259" w:lineRule="auto"/>
+              <w:spacing w:before="0" w:after="0"/>
             </w:pPr>
             <w:r>
               <w:rPr>
@@ -1778,7 +1792,7 @@
       </w:r>
     </w:p>
     <w:bookmarkEnd w:id="10"/>
-    <w:bookmarkStart w:id="11" w:name="path-of-a-lot"/>
+    <w:bookmarkStart w:id="17" w:name="path-of-a-lot"/>
     <w:p>
       <w:pPr>
         <w:pStyle w:val="Heading2"/>
@@ -1789,80 +1803,132 @@
     </w:p>
     <w:p>
       <w:pPr>
-        <w:pStyle w:val="SourceCode"/>
-        <w:shd w:val="clear" w:color="auto" w:fill="F4F7F5"/>
-        <w:spacing w:before="120" w:after="200" w:line="252" w:lineRule="auto"/>
-      </w:pPr>
-      <w:r>
-        <w:rPr>
-          <w:rFonts w:ascii="Consolas" w:hAnsi="Consolas"/>
-          <w:b w:val="0"/>
-          <w:color w:val="1F2937"/>
-          <w:sz w:val="18"/>
-        </w:rPr>
-        <w:t>Parcel in Côte d'Ivoire</w:t>
-        <w:br/>
-      </w:r>
-      <w:r>
-        <w:rPr>
-          <w:rFonts w:ascii="Consolas" w:hAnsi="Consolas"/>
-          <w:b w:val="0"/>
-          <w:color w:val="1F2937"/>
-          <w:sz w:val="18"/>
-        </w:rPr>
-        <w:t xml:space="preserve">  → harvest, signed by the coop</w:t>
-        <w:br/>
-      </w:r>
-      <w:r>
-        <w:rPr>
-          <w:rFonts w:ascii="Consolas" w:hAnsi="Consolas"/>
-          <w:b w:val="0"/>
-          <w:color w:val="1F2937"/>
-          <w:sz w:val="18"/>
-        </w:rPr>
-        <w:t xml:space="preserve">  → merge of many harvests into one intake lot</w:t>
-        <w:br/>
-      </w:r>
-      <w:r>
-        <w:rPr>
-          <w:rFonts w:ascii="Consolas" w:hAnsi="Consolas"/>
-          <w:b w:val="0"/>
-          <w:color w:val="1F2937"/>
-          <w:sz w:val="18"/>
-        </w:rPr>
-        <w:t xml:space="preserve">  → load leaving the country</w:t>
-        <w:br/>
-      </w:r>
-      <w:r>
-        <w:rPr>
-          <w:rFonts w:ascii="Consolas" w:hAnsi="Consolas"/>
-          <w:b w:val="0"/>
-          <w:color w:val="1F2937"/>
-          <w:sz w:val="18"/>
-        </w:rPr>
-        <w:t xml:space="preserve">  → process at a plant in another country</w:t>
-        <w:br/>
-      </w:r>
-      <w:r>
-        <w:rPr>
-          <w:rFonts w:ascii="Consolas" w:hAnsi="Consolas"/>
-          <w:b w:val="0"/>
-          <w:color w:val="1F2937"/>
-          <w:sz w:val="18"/>
-        </w:rPr>
-        <w:t xml:space="preserve">  → claim a buyer and the public can read</w:t>
-      </w:r>
-    </w:p>
-    <w:p>
-      <w:pPr>
         <w:pStyle w:val="FirstParagraph"/>
       </w:pPr>
       <w:r>
-        <w:t xml:space="preserve">Biological origin is Côte d’Ivoire from the harvest onward. The plant’s country is added as the place that processed the lot. The claim shows both. Processing never replaces origin.</w:t>
-      </w:r>
-    </w:p>
-    <w:bookmarkEnd w:id="11"/>
-    <w:bookmarkStart w:id="12" w:name="what-the-pilot-has-to-prove"/>
+        <w:t xml:space="preserve">The coop clerk signs until the lot leaves the country. The plant clerk signs the processing. The claim is calculated. Biological origin stays the country of harvest. The plant’s country is added beside it.</w:t>
+      </w:r>
+    </w:p>
+    <w:p>
+      <w:pPr>
+        <w:pStyle w:val="CaptionedFigure"/>
+      </w:pPr>
+      <w:r>
+        <w:drawing>
+          <wp:inline>
+            <wp:extent cx="5334000" cy="4563533"/>
+            <wp:effectExtent b="0" l="0" r="0" t="0"/>
+            <wp:docPr descr="Parcel, harvest, merge, load, process, and claim, with the person who signs each step" title="" id="12" name="Picture"/>
+            <a:graphic>
+              <a:graphicData uri="http://schemas.openxmlformats.org/drawingml/2006/picture">
+                <pic:pic>
+                  <pic:nvPicPr>
+                    <pic:cNvPr descr="diagrams/lot-flow.png" id="13" name="Picture"/>
+                    <pic:cNvPicPr>
+                      <a:picLocks noChangeArrowheads="1" noChangeAspect="1"/>
+                    </pic:cNvPicPr>
+                  </pic:nvPicPr>
+                  <pic:blipFill>
+                    <a:blip r:embed="rId11"/>
+                    <a:stretch>
+                      <a:fillRect/>
+                    </a:stretch>
+                  </pic:blipFill>
+                  <pic:spPr bwMode="auto">
+                    <a:xfrm>
+                      <a:off x="0" y="0"/>
+                      <a:ext cx="5334000" cy="4563533"/>
+                    </a:xfrm>
+                    <a:prstGeom prst="rect">
+                      <a:avLst/>
+                    </a:prstGeom>
+                    <a:noFill/>
+                    <a:ln w="9525">
+                      <a:noFill/>
+                      <a:headEnd/>
+                      <a:tailEnd/>
+                    </a:ln>
+                  </pic:spPr>
+                </pic:pic>
+              </a:graphicData>
+            </a:graphic>
+          </wp:inline>
+        </w:drawing>
+      </w:r>
+    </w:p>
+    <w:p>
+      <w:pPr>
+        <w:pStyle w:val="ImageCaption"/>
+      </w:pPr>
+      <w:r>
+        <w:t xml:space="preserve">Parcel, harvest, merge, load, process, and claim, with the person who signs each step</w:t>
+      </w:r>
+    </w:p>
+    <w:p>
+      <w:pPr>
+        <w:pStyle w:val="BodyText"/>
+      </w:pPr>
+      <w:r>
+        <w:t xml:space="preserve">The same lot is narrower for a stranger than it is for the coop.</w:t>
+      </w:r>
+    </w:p>
+    <w:p>
+      <w:pPr>
+        <w:pStyle w:val="CaptionedFigure"/>
+      </w:pPr>
+      <w:r>
+        <w:drawing>
+          <wp:inline>
+            <wp:extent cx="5334000" cy="1577008"/>
+            <wp:effectExtent b="0" l="0" r="0" t="0"/>
+            <wp:docPr descr="The same lot, read by the public, the buyer, the holders, the origin authority, and an auditor" title="" id="15" name="Picture"/>
+            <a:graphic>
+              <a:graphicData uri="http://schemas.openxmlformats.org/drawingml/2006/picture">
+                <pic:pic>
+                  <pic:nvPicPr>
+                    <pic:cNvPr descr="diagrams/views.png" id="16" name="Picture"/>
+                    <pic:cNvPicPr>
+                      <a:picLocks noChangeArrowheads="1" noChangeAspect="1"/>
+                    </pic:cNvPicPr>
+                  </pic:nvPicPr>
+                  <pic:blipFill>
+                    <a:blip r:embed="rId14"/>
+                    <a:stretch>
+                      <a:fillRect/>
+                    </a:stretch>
+                  </pic:blipFill>
+                  <pic:spPr bwMode="auto">
+                    <a:xfrm>
+                      <a:off x="0" y="0"/>
+                      <a:ext cx="5334000" cy="1577008"/>
+                    </a:xfrm>
+                    <a:prstGeom prst="rect">
+                      <a:avLst/>
+                    </a:prstGeom>
+                    <a:noFill/>
+                    <a:ln w="9525">
+                      <a:noFill/>
+                      <a:headEnd/>
+                      <a:tailEnd/>
+                    </a:ln>
+                  </pic:spPr>
+                </pic:pic>
+              </a:graphicData>
+            </a:graphic>
+          </wp:inline>
+        </w:drawing>
+      </w:r>
+    </w:p>
+    <w:p>
+      <w:pPr>
+        <w:pStyle w:val="ImageCaption"/>
+      </w:pPr>
+      <w:r>
+        <w:t xml:space="preserve">The same lot, read by the public, the buyer, the holders, the origin authority, and an auditor</w:t>
+      </w:r>
+    </w:p>
+    <w:bookmarkEnd w:id="17"/>
+    <w:bookmarkStart w:id="18" w:name="what-the-pilot-has-to-prove"/>
     <w:p>
       <w:pPr>
         <w:pStyle w:val="Heading2"/>
@@ -1951,9 +2017,9 @@
         <w:t xml:space="preserve">Settlement, payments, and an investigation graph are not part of this proof.</w:t>
       </w:r>
     </w:p>
-    <w:bookmarkEnd w:id="12"/>
-    <w:bookmarkEnd w:id="13"/>
-    <w:bookmarkStart w:id="19" w:name="domain-model"/>
+    <w:bookmarkEnd w:id="18"/>
+    <w:bookmarkEnd w:id="19"/>
+    <w:bookmarkStart w:id="25" w:name="domain-model"/>
     <w:p>
       <w:pPr>
         <w:pStyle w:val="Heading1"/>
@@ -1970,7 +2036,7 @@
         <w:t xml:space="preserve">Quantities are integers in grams. There are no floating-point weights.</w:t>
       </w:r>
     </w:p>
-    <w:bookmarkStart w:id="14" w:name="records"/>
+    <w:bookmarkStart w:id="20" w:name="records"/>
     <w:p>
       <w:pPr>
         <w:pStyle w:val="Heading2"/>
@@ -2022,7 +2088,7 @@
           <w:p>
             <w:pPr>
               <w:pStyle w:val="Compact"/>
-              <w:spacing w:before="0" w:after="0" w:line="259" w:lineRule="auto"/>
+              <w:spacing w:before="0" w:after="0"/>
             </w:pPr>
             <w:r>
               <w:rPr>
@@ -2054,7 +2120,7 @@
           <w:p>
             <w:pPr>
               <w:pStyle w:val="Compact"/>
-              <w:spacing w:before="0" w:after="0" w:line="259" w:lineRule="auto"/>
+              <w:spacing w:before="0" w:after="0"/>
             </w:pPr>
             <w:r>
               <w:rPr>
@@ -2086,7 +2152,7 @@
           <w:p>
             <w:pPr>
               <w:pStyle w:val="Compact"/>
-              <w:spacing w:before="0" w:after="0" w:line="259" w:lineRule="auto"/>
+              <w:spacing w:before="0" w:after="0"/>
             </w:pPr>
             <w:r>
               <w:rPr>
@@ -2120,7 +2186,7 @@
           <w:p>
             <w:pPr>
               <w:pStyle w:val="Compact"/>
-              <w:spacing w:before="0" w:after="0" w:line="259" w:lineRule="auto"/>
+              <w:spacing w:before="0" w:after="0"/>
             </w:pPr>
             <w:r>
               <w:rPr>
@@ -2152,7 +2218,7 @@
           <w:p>
             <w:pPr>
               <w:pStyle w:val="Compact"/>
-              <w:spacing w:before="0" w:after="0" w:line="259" w:lineRule="auto"/>
+              <w:spacing w:before="0" w:after="0"/>
             </w:pPr>
             <w:r>
               <w:rPr>
@@ -2213,7 +2279,7 @@
           <w:p>
             <w:pPr>
               <w:pStyle w:val="Compact"/>
-              <w:spacing w:before="0" w:after="0" w:line="259" w:lineRule="auto"/>
+              <w:spacing w:before="0" w:after="0"/>
             </w:pPr>
             <w:r>
               <w:rPr>
@@ -2247,7 +2313,7 @@
           <w:p>
             <w:pPr>
               <w:pStyle w:val="Compact"/>
-              <w:spacing w:before="0" w:after="0" w:line="259" w:lineRule="auto"/>
+              <w:spacing w:before="0" w:after="0"/>
             </w:pPr>
             <w:r>
               <w:rPr>
@@ -2279,7 +2345,7 @@
           <w:p>
             <w:pPr>
               <w:pStyle w:val="Compact"/>
-              <w:spacing w:before="0" w:after="0" w:line="259" w:lineRule="auto"/>
+              <w:spacing w:before="0" w:after="0"/>
             </w:pPr>
             <w:r>
               <w:rPr>
@@ -2312,7 +2378,7 @@
           <w:p>
             <w:pPr>
               <w:pStyle w:val="Compact"/>
-              <w:spacing w:before="0" w:after="0" w:line="259" w:lineRule="auto"/>
+              <w:spacing w:before="0" w:after="0"/>
             </w:pPr>
             <w:r>
               <w:rPr>
@@ -2346,7 +2412,7 @@
           <w:p>
             <w:pPr>
               <w:pStyle w:val="Compact"/>
-              <w:spacing w:before="0" w:after="0" w:line="259" w:lineRule="auto"/>
+              <w:spacing w:before="0" w:after="0"/>
             </w:pPr>
             <w:r>
               <w:rPr>
@@ -2378,7 +2444,7 @@
           <w:p>
             <w:pPr>
               <w:pStyle w:val="Compact"/>
-              <w:spacing w:before="0" w:after="0" w:line="259" w:lineRule="auto"/>
+              <w:spacing w:before="0" w:after="0"/>
             </w:pPr>
             <w:r>
               <w:rPr>
@@ -2411,7 +2477,7 @@
           <w:p>
             <w:pPr>
               <w:pStyle w:val="Compact"/>
-              <w:spacing w:before="0" w:after="0" w:line="259" w:lineRule="auto"/>
+              <w:spacing w:before="0" w:after="0"/>
             </w:pPr>
             <w:r>
               <w:rPr>
@@ -2482,7 +2548,7 @@
           <w:p>
             <w:pPr>
               <w:pStyle w:val="Compact"/>
-              <w:spacing w:before="0" w:after="0" w:line="259" w:lineRule="auto"/>
+              <w:spacing w:before="0" w:after="0"/>
             </w:pPr>
             <w:r>
               <w:rPr>
@@ -2514,7 +2580,7 @@
           <w:p>
             <w:pPr>
               <w:pStyle w:val="Compact"/>
-              <w:spacing w:before="0" w:after="0" w:line="259" w:lineRule="auto"/>
+              <w:spacing w:before="0" w:after="0"/>
             </w:pPr>
             <w:r>
               <w:rPr>
@@ -2547,7 +2613,7 @@
           <w:p>
             <w:pPr>
               <w:pStyle w:val="Compact"/>
-              <w:spacing w:before="0" w:after="0" w:line="259" w:lineRule="auto"/>
+              <w:spacing w:before="0" w:after="0"/>
             </w:pPr>
             <w:r>
               <w:rPr>
@@ -2609,7 +2675,7 @@
           <w:p>
             <w:pPr>
               <w:pStyle w:val="Compact"/>
-              <w:spacing w:before="0" w:after="0" w:line="259" w:lineRule="auto"/>
+              <w:spacing w:before="0" w:after="0"/>
             </w:pPr>
             <w:r>
               <w:rPr>
@@ -2641,7 +2707,7 @@
           <w:p>
             <w:pPr>
               <w:pStyle w:val="Compact"/>
-              <w:spacing w:before="0" w:after="0" w:line="259" w:lineRule="auto"/>
+              <w:spacing w:before="0" w:after="0"/>
             </w:pPr>
             <w:r>
               <w:rPr>
@@ -2674,7 +2740,7 @@
           <w:p>
             <w:pPr>
               <w:pStyle w:val="Compact"/>
-              <w:spacing w:before="0" w:after="0" w:line="259" w:lineRule="auto"/>
+              <w:spacing w:before="0" w:after="0"/>
             </w:pPr>
             <w:r>
               <w:rPr>
@@ -2708,7 +2774,7 @@
           <w:p>
             <w:pPr>
               <w:pStyle w:val="Compact"/>
-              <w:spacing w:before="0" w:after="0" w:line="259" w:lineRule="auto"/>
+              <w:spacing w:before="0" w:after="0"/>
             </w:pPr>
             <w:r>
               <w:rPr>
@@ -2740,7 +2806,7 @@
           <w:p>
             <w:pPr>
               <w:pStyle w:val="Compact"/>
-              <w:spacing w:before="0" w:after="0" w:line="259" w:lineRule="auto"/>
+              <w:spacing w:before="0" w:after="0"/>
             </w:pPr>
             <w:r>
               <w:rPr>
@@ -2773,7 +2839,7 @@
           <w:p>
             <w:pPr>
               <w:pStyle w:val="Compact"/>
-              <w:spacing w:before="0" w:after="0" w:line="259" w:lineRule="auto"/>
+              <w:spacing w:before="0" w:after="0"/>
             </w:pPr>
             <w:r>
               <w:rPr>
@@ -2796,8 +2862,8 @@
         <w:t xml:space="preserve">Growers and parcels can exist before any login. A parcel stores country, area, commodity, season, and a manual yield ceiling. For the MVP that ceiling is entered by the coop from a published figure for the area. It is the number the harvest is judged against.</w:t>
       </w:r>
     </w:p>
-    <w:bookmarkEnd w:id="14"/>
-    <w:bookmarkStart w:id="15" w:name="event-types-in-the-mvp"/>
+    <w:bookmarkEnd w:id="20"/>
+    <w:bookmarkStart w:id="21" w:name="event-types-in-the-mvp"/>
     <w:p>
       <w:pPr>
         <w:pStyle w:val="Heading2"/>
@@ -2841,7 +2907,7 @@
           <w:p>
             <w:pPr>
               <w:pStyle w:val="Compact"/>
-              <w:spacing w:before="0" w:after="0" w:line="259" w:lineRule="auto"/>
+              <w:spacing w:before="0" w:after="0"/>
             </w:pPr>
             <w:r>
               <w:rPr>
@@ -2873,7 +2939,7 @@
           <w:p>
             <w:pPr>
               <w:pStyle w:val="Compact"/>
-              <w:spacing w:before="0" w:after="0" w:line="259" w:lineRule="auto"/>
+              <w:spacing w:before="0" w:after="0"/>
             </w:pPr>
             <w:r>
               <w:rPr>
@@ -2905,7 +2971,7 @@
           <w:p>
             <w:pPr>
               <w:pStyle w:val="Compact"/>
-              <w:spacing w:before="0" w:after="0" w:line="259" w:lineRule="auto"/>
+              <w:spacing w:before="0" w:after="0"/>
             </w:pPr>
             <w:r>
               <w:rPr>
@@ -2939,7 +3005,7 @@
           <w:p>
             <w:pPr>
               <w:pStyle w:val="Compact"/>
-              <w:spacing w:before="0" w:after="0" w:line="259" w:lineRule="auto"/>
+              <w:spacing w:before="0" w:after="0"/>
             </w:pPr>
             <w:r>
               <w:rPr>
@@ -2972,7 +3038,7 @@
           <w:p>
             <w:pPr>
               <w:pStyle w:val="Compact"/>
-              <w:spacing w:before="0" w:after="0" w:line="259" w:lineRule="auto"/>
+              <w:spacing w:before="0" w:after="0"/>
             </w:pPr>
             <w:r>
               <w:rPr>
@@ -3004,7 +3070,7 @@
           <w:p>
             <w:pPr>
               <w:pStyle w:val="Compact"/>
-              <w:spacing w:before="0" w:after="0" w:line="259" w:lineRule="auto"/>
+              <w:spacing w:before="0" w:after="0"/>
             </w:pPr>
             <w:r>
               <w:rPr>
@@ -3038,7 +3104,7 @@
           <w:p>
             <w:pPr>
               <w:pStyle w:val="Compact"/>
-              <w:spacing w:before="0" w:after="0" w:line="259" w:lineRule="auto"/>
+              <w:spacing w:before="0" w:after="0"/>
             </w:pPr>
             <w:r>
               <w:rPr>
@@ -3071,7 +3137,7 @@
           <w:p>
             <w:pPr>
               <w:pStyle w:val="Compact"/>
-              <w:spacing w:before="0" w:after="0" w:line="259" w:lineRule="auto"/>
+              <w:spacing w:before="0" w:after="0"/>
             </w:pPr>
             <w:r>
               <w:rPr>
@@ -3103,7 +3169,7 @@
           <w:p>
             <w:pPr>
               <w:pStyle w:val="Compact"/>
-              <w:spacing w:before="0" w:after="0" w:line="259" w:lineRule="auto"/>
+              <w:spacing w:before="0" w:after="0"/>
             </w:pPr>
             <w:r>
               <w:rPr>
@@ -3137,7 +3203,7 @@
           <w:p>
             <w:pPr>
               <w:pStyle w:val="Compact"/>
-              <w:spacing w:before="0" w:after="0" w:line="259" w:lineRule="auto"/>
+              <w:spacing w:before="0" w:after="0"/>
             </w:pPr>
             <w:r>
               <w:rPr>
@@ -3170,7 +3236,7 @@
           <w:p>
             <w:pPr>
               <w:pStyle w:val="Compact"/>
-              <w:spacing w:before="0" w:after="0" w:line="259" w:lineRule="auto"/>
+              <w:spacing w:before="0" w:after="0"/>
             </w:pPr>
             <w:r>
               <w:rPr>
@@ -3258,7 +3324,7 @@
           <w:p>
             <w:pPr>
               <w:pStyle w:val="Compact"/>
-              <w:spacing w:before="0" w:after="0" w:line="259" w:lineRule="auto"/>
+              <w:spacing w:before="0" w:after="0"/>
             </w:pPr>
             <w:r>
               <w:rPr>
@@ -3292,7 +3358,7 @@
           <w:p>
             <w:pPr>
               <w:pStyle w:val="Compact"/>
-              <w:spacing w:before="0" w:after="0" w:line="259" w:lineRule="auto"/>
+              <w:spacing w:before="0" w:after="0"/>
             </w:pPr>
             <w:r>
               <w:rPr>
@@ -3325,7 +3391,7 @@
           <w:p>
             <w:pPr>
               <w:pStyle w:val="Compact"/>
-              <w:spacing w:before="0" w:after="0" w:line="259" w:lineRule="auto"/>
+              <w:spacing w:before="0" w:after="0"/>
             </w:pPr>
             <w:r>
               <w:rPr>
@@ -3357,7 +3423,7 @@
           <w:p>
             <w:pPr>
               <w:pStyle w:val="Compact"/>
-              <w:spacing w:before="0" w:after="0" w:line="259" w:lineRule="auto"/>
+              <w:spacing w:before="0" w:after="0"/>
             </w:pPr>
             <w:r>
               <w:rPr>
@@ -3391,7 +3457,7 @@
           <w:p>
             <w:pPr>
               <w:pStyle w:val="Compact"/>
-              <w:spacing w:before="0" w:after="0" w:line="259" w:lineRule="auto"/>
+              <w:spacing w:before="0" w:after="0"/>
             </w:pPr>
             <w:r>
               <w:rPr>
@@ -3424,7 +3490,7 @@
           <w:p>
             <w:pPr>
               <w:pStyle w:val="Compact"/>
-              <w:spacing w:before="0" w:after="0" w:line="259" w:lineRule="auto"/>
+              <w:spacing w:before="0" w:after="0"/>
             </w:pPr>
             <w:r>
               <w:rPr>
@@ -3456,7 +3522,7 @@
           <w:p>
             <w:pPr>
               <w:pStyle w:val="Compact"/>
-              <w:spacing w:before="0" w:after="0" w:line="259" w:lineRule="auto"/>
+              <w:spacing w:before="0" w:after="0"/>
             </w:pPr>
             <w:r>
               <w:rPr>
@@ -3490,7 +3556,7 @@
           <w:p>
             <w:pPr>
               <w:pStyle w:val="Compact"/>
-              <w:spacing w:before="0" w:after="0" w:line="259" w:lineRule="auto"/>
+              <w:spacing w:before="0" w:after="0"/>
             </w:pPr>
             <w:r>
               <w:rPr>
@@ -3523,7 +3589,7 @@
           <w:p>
             <w:pPr>
               <w:pStyle w:val="Compact"/>
-              <w:spacing w:before="0" w:after="0" w:line="259" w:lineRule="auto"/>
+              <w:spacing w:before="0" w:after="0"/>
             </w:pPr>
             <w:r>
               <w:rPr>
@@ -3555,7 +3621,7 @@
           <w:p>
             <w:pPr>
               <w:pStyle w:val="Compact"/>
-              <w:spacing w:before="0" w:after="0" w:line="259" w:lineRule="auto"/>
+              <w:spacing w:before="0" w:after="0"/>
             </w:pPr>
             <w:r>
               <w:rPr>
@@ -3589,7 +3655,7 @@
           <w:p>
             <w:pPr>
               <w:pStyle w:val="Compact"/>
-              <w:spacing w:before="0" w:after="0" w:line="259" w:lineRule="auto"/>
+              <w:spacing w:before="0" w:after="0"/>
             </w:pPr>
             <w:r>
               <w:rPr>
@@ -3622,7 +3688,7 @@
           <w:p>
             <w:pPr>
               <w:pStyle w:val="Compact"/>
-              <w:spacing w:before="0" w:after="0" w:line="259" w:lineRule="auto"/>
+              <w:spacing w:before="0" w:after="0"/>
             </w:pPr>
             <w:r>
               <w:rPr>
@@ -3654,7 +3720,7 @@
           <w:p>
             <w:pPr>
               <w:pStyle w:val="Compact"/>
-              <w:spacing w:before="0" w:after="0" w:line="259" w:lineRule="auto"/>
+              <w:spacing w:before="0" w:after="0"/>
             </w:pPr>
             <w:r>
               <w:rPr>
@@ -3710,8 +3776,8 @@
         <w:t xml:space="preserve">exist as names in the product model. They are not required to finish the cashew MVP. A voyage with an extra port is the first event type added when a real shipment needs it.</w:t>
       </w:r>
     </w:p>
-    <w:bookmarkEnd w:id="15"/>
-    <w:bookmarkStart w:id="16" w:name="canonical-event"/>
+    <w:bookmarkEnd w:id="21"/>
+    <w:bookmarkStart w:id="22" w:name="canonical-event"/>
     <w:p>
       <w:pPr>
         <w:pStyle w:val="Heading2"/>
@@ -3731,8 +3797,6 @@
     <w:p>
       <w:pPr>
         <w:pStyle w:val="SourceCode"/>
-        <w:shd w:val="clear" w:color="auto" w:fill="F4F7F5"/>
-        <w:spacing w:before="120" w:after="200" w:line="252" w:lineRule="auto"/>
       </w:pPr>
       <w:r>
         <w:rPr>
@@ -3938,8 +4002,8 @@
         <w:t xml:space="preserve">returns the stored event.</w:t>
       </w:r>
     </w:p>
-    <w:bookmarkEnd w:id="16"/>
-    <w:bookmarkStart w:id="17" w:name="claims-and-bands"/>
+    <w:bookmarkEnd w:id="22"/>
+    <w:bookmarkStart w:id="23" w:name="claims-and-bands"/>
     <w:p>
       <w:pPr>
         <w:pStyle w:val="Heading2"/>
@@ -3990,7 +4054,7 @@
           <w:p>
             <w:pPr>
               <w:pStyle w:val="Compact"/>
-              <w:spacing w:before="0" w:after="0" w:line="259" w:lineRule="auto"/>
+              <w:spacing w:before="0" w:after="0"/>
             </w:pPr>
             <w:r>
               <w:rPr>
@@ -4022,7 +4086,7 @@
           <w:p>
             <w:pPr>
               <w:pStyle w:val="Compact"/>
-              <w:spacing w:before="0" w:after="0" w:line="259" w:lineRule="auto"/>
+              <w:spacing w:before="0" w:after="0"/>
             </w:pPr>
             <w:r>
               <w:rPr>
@@ -4056,7 +4120,7 @@
           <w:p>
             <w:pPr>
               <w:pStyle w:val="Compact"/>
-              <w:spacing w:before="0" w:after="0" w:line="259" w:lineRule="auto"/>
+              <w:spacing w:before="0" w:after="0"/>
             </w:pPr>
             <w:r>
               <w:rPr>
@@ -4088,7 +4152,7 @@
           <w:p>
             <w:pPr>
               <w:pStyle w:val="Compact"/>
-              <w:spacing w:before="0" w:after="0" w:line="259" w:lineRule="auto"/>
+              <w:spacing w:before="0" w:after="0"/>
             </w:pPr>
             <w:r>
               <w:rPr>
@@ -4122,7 +4186,7 @@
           <w:p>
             <w:pPr>
               <w:pStyle w:val="Compact"/>
-              <w:spacing w:before="0" w:after="0" w:line="259" w:lineRule="auto"/>
+              <w:spacing w:before="0" w:after="0"/>
             </w:pPr>
             <w:r>
               <w:rPr>
@@ -4154,7 +4218,7 @@
           <w:p>
             <w:pPr>
               <w:pStyle w:val="Compact"/>
-              <w:spacing w:before="0" w:after="0" w:line="259" w:lineRule="auto"/>
+              <w:spacing w:before="0" w:after="0"/>
             </w:pPr>
             <w:r>
               <w:rPr>
@@ -4188,7 +4252,7 @@
           <w:p>
             <w:pPr>
               <w:pStyle w:val="Compact"/>
-              <w:spacing w:before="0" w:after="0" w:line="259" w:lineRule="auto"/>
+              <w:spacing w:before="0" w:after="0"/>
             </w:pPr>
             <w:r>
               <w:rPr>
@@ -4220,7 +4284,7 @@
           <w:p>
             <w:pPr>
               <w:pStyle w:val="Compact"/>
-              <w:spacing w:before="0" w:after="0" w:line="259" w:lineRule="auto"/>
+              <w:spacing w:before="0" w:after="0"/>
             </w:pPr>
             <w:r>
               <w:rPr>
@@ -4291,7 +4355,7 @@
           <w:p>
             <w:pPr>
               <w:pStyle w:val="Compact"/>
-              <w:spacing w:before="0" w:after="0" w:line="259" w:lineRule="auto"/>
+              <w:spacing w:before="0" w:after="0"/>
             </w:pPr>
             <w:r>
               <w:rPr>
@@ -4323,7 +4387,7 @@
           <w:p>
             <w:pPr>
               <w:pStyle w:val="Compact"/>
-              <w:spacing w:before="0" w:after="0" w:line="259" w:lineRule="auto"/>
+              <w:spacing w:before="0" w:after="0"/>
             </w:pPr>
             <w:r>
               <w:rPr>
@@ -4404,7 +4468,7 @@
           <w:p>
             <w:pPr>
               <w:pStyle w:val="Compact"/>
-              <w:spacing w:before="0" w:after="0" w:line="259" w:lineRule="auto"/>
+              <w:spacing w:before="0" w:after="0"/>
             </w:pPr>
             <w:r>
               <w:rPr>
@@ -4436,7 +4500,7 @@
           <w:p>
             <w:pPr>
               <w:pStyle w:val="Compact"/>
-              <w:spacing w:before="0" w:after="0" w:line="259" w:lineRule="auto"/>
+              <w:spacing w:before="0" w:after="0"/>
             </w:pPr>
             <w:r>
               <w:rPr>
@@ -4507,7 +4571,7 @@
           <w:p>
             <w:pPr>
               <w:pStyle w:val="Compact"/>
-              <w:spacing w:before="0" w:after="0" w:line="259" w:lineRule="auto"/>
+              <w:spacing w:before="0" w:after="0"/>
             </w:pPr>
             <w:r>
               <w:rPr>
@@ -4539,16 +4603,16 @@
           <w:p>
             <w:pPr>
               <w:pStyle w:val="Compact"/>
-              <w:spacing w:before="0" w:after="0" w:line="259" w:lineRule="auto"/>
-            </w:pPr>
-            <w:r>
-              <w:rPr>
-                <w:rFonts w:ascii="Calibri" w:hAnsi="Calibri"/>
-                <w:b w:val="0"/>
-                <w:color w:val="1F2937"/>
-                <w:sz w:val="20"/>
-              </w:rPr>
-              <w:t xml:space="preserve">A bucket, not the gram value: under 1 t, 1–5 t, 5–20 t, 20 t and over.</w:t>
+              <w:spacing w:before="0" w:after="0"/>
+            </w:pPr>
+            <w:r>
+              <w:rPr>
+                <w:rFonts w:ascii="Calibri" w:hAnsi="Calibri"/>
+                <w:b w:val="0"/>
+                <w:color w:val="1F2937"/>
+                <w:sz w:val="20"/>
+              </w:rPr>
+              <w:t xml:space="preserve">A bucket from the commodity profile, not the gram value. The cashew profile uses under 1 t, 1–5 t, 5–20 t, and 20 t and over.</w:t>
             </w:r>
           </w:p>
         </w:tc>
@@ -4562,8 +4626,8 @@
         <w:t xml:space="preserve">The buyer and the public page receive the band. The coop, the plant, and an opened audit receive grams.</w:t>
       </w:r>
     </w:p>
-    <w:bookmarkEnd w:id="17"/>
-    <w:bookmarkStart w:id="18" w:name="checks-that-open-an-alert"/>
+    <w:bookmarkEnd w:id="23"/>
+    <w:bookmarkStart w:id="24" w:name="checks-that-open-an-alert"/>
     <w:p>
       <w:pPr>
         <w:pStyle w:val="Heading2"/>
@@ -4626,7 +4690,7 @@
           <w:p>
             <w:pPr>
               <w:pStyle w:val="Compact"/>
-              <w:spacing w:before="0" w:after="0" w:line="259" w:lineRule="auto"/>
+              <w:spacing w:before="0" w:after="0"/>
             </w:pPr>
             <w:r>
               <w:rPr>
@@ -4658,7 +4722,7 @@
           <w:p>
             <w:pPr>
               <w:pStyle w:val="Compact"/>
-              <w:spacing w:before="0" w:after="0" w:line="259" w:lineRule="auto"/>
+              <w:spacing w:before="0" w:after="0"/>
             </w:pPr>
             <w:r>
               <w:rPr>
@@ -4692,7 +4756,7 @@
           <w:p>
             <w:pPr>
               <w:pStyle w:val="Compact"/>
-              <w:spacing w:before="0" w:after="0" w:line="259" w:lineRule="auto"/>
+              <w:spacing w:before="0" w:after="0"/>
             </w:pPr>
             <w:r>
               <w:rPr>
@@ -4724,7 +4788,7 @@
           <w:p>
             <w:pPr>
               <w:pStyle w:val="Compact"/>
-              <w:spacing w:before="0" w:after="0" w:line="259" w:lineRule="auto"/>
+              <w:spacing w:before="0" w:after="0"/>
             </w:pPr>
             <w:r>
               <w:rPr>
@@ -4758,7 +4822,7 @@
           <w:p>
             <w:pPr>
               <w:pStyle w:val="Compact"/>
-              <w:spacing w:before="0" w:after="0" w:line="259" w:lineRule="auto"/>
+              <w:spacing w:before="0" w:after="0"/>
             </w:pPr>
             <w:r>
               <w:rPr>
@@ -4790,7 +4854,7 @@
           <w:p>
             <w:pPr>
               <w:pStyle w:val="Compact"/>
-              <w:spacing w:before="0" w:after="0" w:line="259" w:lineRule="auto"/>
+              <w:spacing w:before="0" w:after="0"/>
             </w:pPr>
             <w:r>
               <w:rPr>
@@ -4824,7 +4888,7 @@
           <w:p>
             <w:pPr>
               <w:pStyle w:val="Compact"/>
-              <w:spacing w:before="0" w:after="0" w:line="259" w:lineRule="auto"/>
+              <w:spacing w:before="0" w:after="0"/>
             </w:pPr>
             <w:r>
               <w:rPr>
@@ -4856,7 +4920,7 @@
           <w:p>
             <w:pPr>
               <w:pStyle w:val="Compact"/>
-              <w:spacing w:before="0" w:after="0" w:line="259" w:lineRule="auto"/>
+              <w:spacing w:before="0" w:after="0"/>
             </w:pPr>
             <w:r>
               <w:rPr>
@@ -4890,7 +4954,7 @@
           <w:p>
             <w:pPr>
               <w:pStyle w:val="Compact"/>
-              <w:spacing w:before="0" w:after="0" w:line="259" w:lineRule="auto"/>
+              <w:spacing w:before="0" w:after="0"/>
             </w:pPr>
             <w:r>
               <w:rPr>
@@ -4922,7 +4986,7 @@
           <w:p>
             <w:pPr>
               <w:pStyle w:val="Compact"/>
-              <w:spacing w:before="0" w:after="0" w:line="259" w:lineRule="auto"/>
+              <w:spacing w:before="0" w:after="0"/>
             </w:pPr>
             <w:r>
               <w:rPr>
@@ -4956,7 +5020,7 @@
           <w:p>
             <w:pPr>
               <w:pStyle w:val="Compact"/>
-              <w:spacing w:before="0" w:after="0" w:line="259" w:lineRule="auto"/>
+              <w:spacing w:before="0" w:after="0"/>
             </w:pPr>
             <w:r>
               <w:rPr>
@@ -4988,7 +5052,7 @@
           <w:p>
             <w:pPr>
               <w:pStyle w:val="Compact"/>
-              <w:spacing w:before="0" w:after="0" w:line="259" w:lineRule="auto"/>
+              <w:spacing w:before="0" w:after="0"/>
             </w:pPr>
             <w:r>
               <w:rPr>
@@ -5040,9 +5104,9 @@
         </w:tc>
       </w:tr>
     </w:tbl>
-    <w:bookmarkEnd w:id="18"/>
-    <w:bookmarkEnd w:id="19"/>
-    <w:bookmarkStart w:id="25" w:name="technical-architecture"/>
+    <w:bookmarkEnd w:id="24"/>
+    <w:bookmarkEnd w:id="25"/>
+    <w:bookmarkStart w:id="37" w:name="technical-architecture"/>
     <w:p>
       <w:pPr>
         <w:pStyle w:val="Heading1"/>
@@ -5062,129 +5126,68 @@
     </w:p>
     <w:p>
       <w:pPr>
-        <w:pStyle w:val="SourceCode"/>
-        <w:shd w:val="clear" w:color="auto" w:fill="F4F7F5"/>
-        <w:spacing w:before="120" w:after="200" w:line="252" w:lineRule="auto"/>
-      </w:pPr>
-      <w:r>
-        <w:rPr>
-          <w:rFonts w:ascii="Consolas" w:hAnsi="Consolas"/>
-          <w:b w:val="0"/>
-          <w:color w:val="1F2937"/>
-          <w:sz w:val="18"/>
-        </w:rPr>
-        <w:t>Browser (coop, plant, buyer, authority, public claim)</w:t>
-        <w:br/>
-      </w:r>
-      <w:r>
-        <w:rPr>
-          <w:rFonts w:ascii="Consolas" w:hAnsi="Consolas"/>
-          <w:b w:val="0"/>
-          <w:color w:val="1F2937"/>
-          <w:sz w:val="18"/>
-        </w:rPr>
-        <w:t xml:space="preserve">        |  session cookie for staff</w:t>
-        <w:br/>
-      </w:r>
-      <w:r>
-        <w:rPr>
-          <w:rFonts w:ascii="Consolas" w:hAnsi="Consolas"/>
-          <w:b w:val="0"/>
-          <w:color w:val="1F2937"/>
-          <w:sz w:val="18"/>
-        </w:rPr>
-        <w:t xml:space="preserve">        |  Ed25519 signature on each event</w:t>
-        <w:br/>
-      </w:r>
-      <w:r>
-        <w:rPr>
-          <w:rFonts w:ascii="Consolas" w:hAnsi="Consolas"/>
-          <w:b w:val="0"/>
-          <w:color w:val="1F2937"/>
-          <w:sz w:val="18"/>
-        </w:rPr>
-        <w:t xml:space="preserve">        v</w:t>
-        <w:br/>
-      </w:r>
-      <w:r>
-        <w:rPr>
-          <w:rFonts w:ascii="Consolas" w:hAnsi="Consolas"/>
-          <w:b w:val="0"/>
-          <w:color w:val="1F2937"/>
-          <w:sz w:val="18"/>
-        </w:rPr>
-        <w:t>Next.js service</w:t>
-        <w:br/>
-      </w:r>
-      <w:r>
-        <w:rPr>
-          <w:rFonts w:ascii="Consolas" w:hAnsi="Consolas"/>
-          <w:b w:val="0"/>
-          <w:color w:val="1F2937"/>
-          <w:sz w:val="18"/>
-        </w:rPr>
-        <w:t xml:space="preserve">  UI routes</w:t>
-        <w:br/>
-      </w:r>
-      <w:r>
-        <w:rPr>
-          <w:rFonts w:ascii="Consolas" w:hAnsi="Consolas"/>
-          <w:b w:val="0"/>
-          <w:color w:val="1F2937"/>
-          <w:sz w:val="18"/>
-        </w:rPr>
-        <w:t xml:space="preserve">  HTTP API  /api/v1/...</w:t>
-        <w:br/>
-      </w:r>
-      <w:r>
-        <w:rPr>
-          <w:rFonts w:ascii="Consolas" w:hAnsi="Consolas"/>
-          <w:b w:val="0"/>
-          <w:color w:val="1F2937"/>
-          <w:sz w:val="18"/>
-        </w:rPr>
-        <w:t xml:space="preserve">        |</w:t>
-        <w:br/>
-      </w:r>
-      <w:r>
-        <w:rPr>
-          <w:rFonts w:ascii="Consolas" w:hAnsi="Consolas"/>
-          <w:b w:val="0"/>
-          <w:color w:val="1F2937"/>
-          <w:sz w:val="18"/>
-        </w:rPr>
-        <w:t xml:space="preserve">        v</w:t>
-        <w:br/>
-      </w:r>
-      <w:r>
-        <w:rPr>
-          <w:rFonts w:ascii="Consolas" w:hAnsi="Consolas"/>
-          <w:b w:val="0"/>
-          <w:color w:val="1F2937"/>
-          <w:sz w:val="18"/>
-        </w:rPr>
-        <w:t>Postgres</w:t>
-        <w:br/>
-      </w:r>
-      <w:r>
-        <w:rPr>
-          <w:rFonts w:ascii="Consolas" w:hAnsi="Consolas"/>
-          <w:b w:val="0"/>
-          <w:color w:val="1F2937"/>
-          <w:sz w:val="18"/>
-        </w:rPr>
-        <w:t xml:space="preserve">  actors, places, lots, events, claims, alerts</w:t>
-      </w:r>
-    </w:p>
-    <w:p>
-      <w:pPr>
-        <w:pStyle w:val="FirstParagraph"/>
+        <w:pStyle w:val="CaptionedFigure"/>
+      </w:pPr>
+      <w:r>
+        <w:drawing>
+          <wp:inline>
+            <wp:extent cx="5334000" cy="2518833"/>
+            <wp:effectExtent b="0" l="0" r="0" t="0"/>
+            <wp:docPr descr="Browser, API, kernel tables, and configuration" title="" id="27" name="Picture"/>
+            <a:graphic>
+              <a:graphicData uri="http://schemas.openxmlformats.org/drawingml/2006/picture">
+                <pic:pic>
+                  <pic:nvPicPr>
+                    <pic:cNvPr descr="diagrams/architecture.png" id="28" name="Picture"/>
+                    <pic:cNvPicPr>
+                      <a:picLocks noChangeArrowheads="1" noChangeAspect="1"/>
+                    </pic:cNvPicPr>
+                  </pic:nvPicPr>
+                  <pic:blipFill>
+                    <a:blip r:embed="rId26"/>
+                    <a:stretch>
+                      <a:fillRect/>
+                    </a:stretch>
+                  </pic:blipFill>
+                  <pic:spPr bwMode="auto">
+                    <a:xfrm>
+                      <a:off x="0" y="0"/>
+                      <a:ext cx="5334000" cy="2518833"/>
+                    </a:xfrm>
+                    <a:prstGeom prst="rect">
+                      <a:avLst/>
+                    </a:prstGeom>
+                    <a:noFill/>
+                    <a:ln w="9525">
+                      <a:noFill/>
+                      <a:headEnd/>
+                      <a:tailEnd/>
+                    </a:ln>
+                  </pic:spPr>
+                </pic:pic>
+              </a:graphicData>
+            </a:graphic>
+          </wp:inline>
+        </w:drawing>
+      </w:r>
+    </w:p>
+    <w:p>
+      <w:pPr>
+        <w:pStyle w:val="ImageCaption"/>
+      </w:pPr>
+      <w:r>
+        <w:t xml:space="preserve">Browser, API, kernel tables, and configuration</w:t>
+      </w:r>
+    </w:p>
+    <w:p>
+      <w:pPr>
+        <w:pStyle w:val="BodyText"/>
       </w:pPr>
       <w:r>
         <w:t xml:space="preserve">There is no worker, cache, or object store in the MVP. Document files stay with the party who holds them. The event stores the SHA-256 of the file.</w:t>
       </w:r>
     </w:p>
-    <w:bookmarkStart w:id="20" w:name="stack"/>
+    <w:bookmarkStart w:id="29" w:name="stack"/>
     <w:p>
       <w:pPr>
         <w:pStyle w:val="Heading2"/>
@@ -5227,7 +5230,7 @@
           <w:p>
             <w:pPr>
               <w:pStyle w:val="Compact"/>
-              <w:spacing w:before="0" w:after="0" w:line="259" w:lineRule="auto"/>
+              <w:spacing w:before="0" w:after="0"/>
             </w:pPr>
             <w:r>
               <w:rPr>
@@ -5259,7 +5262,7 @@
           <w:p>
             <w:pPr>
               <w:pStyle w:val="Compact"/>
-              <w:spacing w:before="0" w:after="0" w:line="259" w:lineRule="auto"/>
+              <w:spacing w:before="0" w:after="0"/>
             </w:pPr>
             <w:r>
               <w:rPr>
@@ -5293,7 +5296,7 @@
           <w:p>
             <w:pPr>
               <w:pStyle w:val="Compact"/>
-              <w:spacing w:before="0" w:after="0" w:line="259" w:lineRule="auto"/>
+              <w:spacing w:before="0" w:after="0"/>
             </w:pPr>
             <w:r>
               <w:rPr>
@@ -5325,7 +5328,7 @@
           <w:p>
             <w:pPr>
               <w:pStyle w:val="Compact"/>
-              <w:spacing w:before="0" w:after="0" w:line="259" w:lineRule="auto"/>
+              <w:spacing w:before="0" w:after="0"/>
             </w:pPr>
             <w:r>
               <w:rPr>
@@ -5359,7 +5362,7 @@
           <w:p>
             <w:pPr>
               <w:pStyle w:val="Compact"/>
-              <w:spacing w:before="0" w:after="0" w:line="259" w:lineRule="auto"/>
+              <w:spacing w:before="0" w:after="0"/>
             </w:pPr>
             <w:r>
               <w:rPr>
@@ -5391,7 +5394,7 @@
           <w:p>
             <w:pPr>
               <w:pStyle w:val="Compact"/>
-              <w:spacing w:before="0" w:after="0" w:line="259" w:lineRule="auto"/>
+              <w:spacing w:before="0" w:after="0"/>
             </w:pPr>
             <w:r>
               <w:rPr>
@@ -5425,7 +5428,7 @@
           <w:p>
             <w:pPr>
               <w:pStyle w:val="Compact"/>
-              <w:spacing w:before="0" w:after="0" w:line="259" w:lineRule="auto"/>
+              <w:spacing w:before="0" w:after="0"/>
             </w:pPr>
             <w:r>
               <w:rPr>
@@ -5457,7 +5460,7 @@
           <w:p>
             <w:pPr>
               <w:pStyle w:val="Compact"/>
-              <w:spacing w:before="0" w:after="0" w:line="259" w:lineRule="auto"/>
+              <w:spacing w:before="0" w:after="0"/>
             </w:pPr>
             <w:r>
               <w:rPr>
@@ -5519,7 +5522,7 @@
           <w:p>
             <w:pPr>
               <w:pStyle w:val="Compact"/>
-              <w:spacing w:before="0" w:after="0" w:line="259" w:lineRule="auto"/>
+              <w:spacing w:before="0" w:after="0"/>
             </w:pPr>
             <w:r>
               <w:rPr>
@@ -5551,7 +5554,7 @@
           <w:p>
             <w:pPr>
               <w:pStyle w:val="Compact"/>
-              <w:spacing w:before="0" w:after="0" w:line="259" w:lineRule="auto"/>
+              <w:spacing w:before="0" w:after="0"/>
             </w:pPr>
             <w:r>
               <w:rPr>
@@ -5585,7 +5588,7 @@
           <w:p>
             <w:pPr>
               <w:pStyle w:val="Compact"/>
-              <w:spacing w:before="0" w:after="0" w:line="259" w:lineRule="auto"/>
+              <w:spacing w:before="0" w:after="0"/>
             </w:pPr>
             <w:r>
               <w:rPr>
@@ -5617,7 +5620,7 @@
           <w:p>
             <w:pPr>
               <w:pStyle w:val="Compact"/>
-              <w:spacing w:before="0" w:after="0" w:line="259" w:lineRule="auto"/>
+              <w:spacing w:before="0" w:after="0"/>
             </w:pPr>
             <w:r>
               <w:rPr>
@@ -5651,7 +5654,7 @@
           <w:p>
             <w:pPr>
               <w:pStyle w:val="Compact"/>
-              <w:spacing w:before="0" w:after="0" w:line="259" w:lineRule="auto"/>
+              <w:spacing w:before="0" w:after="0"/>
             </w:pPr>
             <w:r>
               <w:rPr>
@@ -5683,7 +5686,7 @@
           <w:p>
             <w:pPr>
               <w:pStyle w:val="Compact"/>
-              <w:spacing w:before="0" w:after="0" w:line="259" w:lineRule="auto"/>
+              <w:spacing w:before="0" w:after="0"/>
             </w:pPr>
             <w:r>
               <w:rPr>
@@ -5717,7 +5720,7 @@
           <w:p>
             <w:pPr>
               <w:pStyle w:val="Compact"/>
-              <w:spacing w:before="0" w:after="0" w:line="259" w:lineRule="auto"/>
+              <w:spacing w:before="0" w:after="0"/>
             </w:pPr>
             <w:r>
               <w:rPr>
@@ -5749,7 +5752,7 @@
           <w:p>
             <w:pPr>
               <w:pStyle w:val="Compact"/>
-              <w:spacing w:before="0" w:after="0" w:line="259" w:lineRule="auto"/>
+              <w:spacing w:before="0" w:after="0"/>
             </w:pPr>
             <w:r>
               <w:rPr>
@@ -5811,7 +5814,7 @@
           <w:p>
             <w:pPr>
               <w:pStyle w:val="Compact"/>
-              <w:spacing w:before="0" w:after="0" w:line="259" w:lineRule="auto"/>
+              <w:spacing w:before="0" w:after="0"/>
             </w:pPr>
             <w:r>
               <w:rPr>
@@ -5843,7 +5846,7 @@
           <w:p>
             <w:pPr>
               <w:pStyle w:val="Compact"/>
-              <w:spacing w:before="0" w:after="0" w:line="259" w:lineRule="auto"/>
+              <w:spacing w:before="0" w:after="0"/>
             </w:pPr>
             <w:r>
               <w:rPr>
@@ -5877,7 +5880,7 @@
           <w:p>
             <w:pPr>
               <w:pStyle w:val="Compact"/>
-              <w:spacing w:before="0" w:after="0" w:line="259" w:lineRule="auto"/>
+              <w:spacing w:before="0" w:after="0"/>
             </w:pPr>
             <w:r>
               <w:rPr>
@@ -5909,7 +5912,7 @@
           <w:p>
             <w:pPr>
               <w:pStyle w:val="Compact"/>
-              <w:spacing w:before="0" w:after="0" w:line="259" w:lineRule="auto"/>
+              <w:spacing w:before="0" w:after="0"/>
             </w:pPr>
             <w:r>
               <w:rPr>
@@ -5943,7 +5946,7 @@
           <w:p>
             <w:pPr>
               <w:pStyle w:val="Compact"/>
-              <w:spacing w:before="0" w:after="0" w:line="259" w:lineRule="auto"/>
+              <w:spacing w:before="0" w:after="0"/>
             </w:pPr>
             <w:r>
               <w:rPr>
@@ -5975,7 +5978,7 @@
           <w:p>
             <w:pPr>
               <w:pStyle w:val="Compact"/>
-              <w:spacing w:before="0" w:after="0" w:line="259" w:lineRule="auto"/>
+              <w:spacing w:before="0" w:after="0"/>
             </w:pPr>
             <w:r>
               <w:rPr>
@@ -5998,14 +6001,69 @@
         <w:t xml:space="preserve">The private key is generated in the browser when an organization enrolls. It is encrypted with a passphrase the organization keeps. The server may store the ciphertext so a new clerk machine can download it. The server cannot decrypt it. Signing happens in the browser after the passphrase is entered.</w:t>
       </w:r>
     </w:p>
-    <w:bookmarkEnd w:id="20"/>
-    <w:bookmarkStart w:id="21" w:name="write-path"/>
+    <w:bookmarkEnd w:id="29"/>
+    <w:bookmarkStart w:id="33" w:name="write-path"/>
     <w:p>
       <w:pPr>
         <w:pStyle w:val="Heading2"/>
       </w:pPr>
       <w:r>
         <w:t xml:space="preserve">Write path</w:t>
+      </w:r>
+    </w:p>
+    <w:p>
+      <w:pPr>
+        <w:pStyle w:val="CaptionedFigure"/>
+      </w:pPr>
+      <w:r>
+        <w:drawing>
+          <wp:inline>
+            <wp:extent cx="5334000" cy="776908"/>
+            <wp:effectExtent b="0" l="0" r="0" t="0"/>
+            <wp:docPr descr="Session, event, signature, checks, store, and reply" title="" id="31" name="Picture"/>
+            <a:graphic>
+              <a:graphicData uri="http://schemas.openxmlformats.org/drawingml/2006/picture">
+                <pic:pic>
+                  <pic:nvPicPr>
+                    <pic:cNvPr descr="diagrams/write-path.png" id="32" name="Picture"/>
+                    <pic:cNvPicPr>
+                      <a:picLocks noChangeArrowheads="1" noChangeAspect="1"/>
+                    </pic:cNvPicPr>
+                  </pic:nvPicPr>
+                  <pic:blipFill>
+                    <a:blip r:embed="rId30"/>
+                    <a:stretch>
+                      <a:fillRect/>
+                    </a:stretch>
+                  </pic:blipFill>
+                  <pic:spPr bwMode="auto">
+                    <a:xfrm>
+                      <a:off x="0" y="0"/>
+                      <a:ext cx="5334000" cy="776908"/>
+                    </a:xfrm>
+                    <a:prstGeom prst="rect">
+                      <a:avLst/>
+                    </a:prstGeom>
+                    <a:noFill/>
+                    <a:ln w="9525">
+                      <a:noFill/>
+                      <a:headEnd/>
+                      <a:tailEnd/>
+                    </a:ln>
+                  </pic:spPr>
+                </pic:pic>
+              </a:graphicData>
+            </a:graphic>
+          </wp:inline>
+        </w:drawing>
+      </w:r>
+    </w:p>
+    <w:p>
+      <w:pPr>
+        <w:pStyle w:val="ImageCaption"/>
+      </w:pPr>
+      <w:r>
+        <w:t xml:space="preserve">Session, event, signature, checks, store, and reply</w:t>
       </w:r>
     </w:p>
     <w:p>
@@ -6145,8 +6203,8 @@
         <w:t xml:space="preserve">. The client reloads the head and asks the clerk to submit again.</w:t>
       </w:r>
     </w:p>
-    <w:bookmarkEnd w:id="21"/>
-    <w:bookmarkStart w:id="22" w:name="read-path"/>
+    <w:bookmarkEnd w:id="33"/>
+    <w:bookmarkStart w:id="34" w:name="read-path"/>
     <w:p>
       <w:pPr>
         <w:pStyle w:val="Heading2"/>
@@ -6190,7 +6248,7 @@
           <w:p>
             <w:pPr>
               <w:pStyle w:val="Compact"/>
-              <w:spacing w:before="0" w:after="0" w:line="259" w:lineRule="auto"/>
+              <w:spacing w:before="0" w:after="0"/>
             </w:pPr>
             <w:r>
               <w:rPr>
@@ -6222,7 +6280,7 @@
           <w:p>
             <w:pPr>
               <w:pStyle w:val="Compact"/>
-              <w:spacing w:before="0" w:after="0" w:line="259" w:lineRule="auto"/>
+              <w:spacing w:before="0" w:after="0"/>
             </w:pPr>
             <w:r>
               <w:rPr>
@@ -6254,7 +6312,7 @@
           <w:p>
             <w:pPr>
               <w:pStyle w:val="Compact"/>
-              <w:spacing w:before="0" w:after="0" w:line="259" w:lineRule="auto"/>
+              <w:spacing w:before="0" w:after="0"/>
             </w:pPr>
             <w:r>
               <w:rPr>
@@ -6288,7 +6346,7 @@
           <w:p>
             <w:pPr>
               <w:pStyle w:val="Compact"/>
-              <w:spacing w:before="0" w:after="0" w:line="259" w:lineRule="auto"/>
+              <w:spacing w:before="0" w:after="0"/>
             </w:pPr>
             <w:r>
               <w:rPr>
@@ -6321,7 +6379,7 @@
           <w:p>
             <w:pPr>
               <w:pStyle w:val="Compact"/>
-              <w:spacing w:before="0" w:after="0" w:line="259" w:lineRule="auto"/>
+              <w:spacing w:before="0" w:after="0"/>
             </w:pPr>
             <w:r>
               <w:rPr>
@@ -6353,7 +6411,7 @@
           <w:p>
             <w:pPr>
               <w:pStyle w:val="Compact"/>
-              <w:spacing w:before="0" w:after="0" w:line="259" w:lineRule="auto"/>
+              <w:spacing w:before="0" w:after="0"/>
             </w:pPr>
             <w:r>
               <w:rPr>
@@ -6387,7 +6445,7 @@
           <w:p>
             <w:pPr>
               <w:pStyle w:val="Compact"/>
-              <w:spacing w:before="0" w:after="0" w:line="259" w:lineRule="auto"/>
+              <w:spacing w:before="0" w:after="0"/>
             </w:pPr>
             <w:r>
               <w:rPr>
@@ -6420,7 +6478,7 @@
           <w:p>
             <w:pPr>
               <w:pStyle w:val="Compact"/>
-              <w:spacing w:before="0" w:after="0" w:line="259" w:lineRule="auto"/>
+              <w:spacing w:before="0" w:after="0"/>
             </w:pPr>
             <w:r>
               <w:rPr>
@@ -6452,7 +6510,7 @@
           <w:p>
             <w:pPr>
               <w:pStyle w:val="Compact"/>
-              <w:spacing w:before="0" w:after="0" w:line="259" w:lineRule="auto"/>
+              <w:spacing w:before="0" w:after="0"/>
             </w:pPr>
             <w:r>
               <w:rPr>
@@ -6486,7 +6544,7 @@
           <w:p>
             <w:pPr>
               <w:pStyle w:val="Compact"/>
-              <w:spacing w:before="0" w:after="0" w:line="259" w:lineRule="auto"/>
+              <w:spacing w:before="0" w:after="0"/>
             </w:pPr>
             <w:r>
               <w:rPr>
@@ -6519,7 +6577,7 @@
           <w:p>
             <w:pPr>
               <w:pStyle w:val="Compact"/>
-              <w:spacing w:before="0" w:after="0" w:line="259" w:lineRule="auto"/>
+              <w:spacing w:before="0" w:after="0"/>
             </w:pPr>
             <w:r>
               <w:rPr>
@@ -6551,7 +6609,7 @@
           <w:p>
             <w:pPr>
               <w:pStyle w:val="Compact"/>
-              <w:spacing w:before="0" w:after="0" w:line="259" w:lineRule="auto"/>
+              <w:spacing w:before="0" w:after="0"/>
             </w:pPr>
             <w:r>
               <w:rPr>
@@ -6585,7 +6643,7 @@
           <w:p>
             <w:pPr>
               <w:pStyle w:val="Compact"/>
-              <w:spacing w:before="0" w:after="0" w:line="259" w:lineRule="auto"/>
+              <w:spacing w:before="0" w:after="0"/>
             </w:pPr>
             <w:r>
               <w:rPr>
@@ -6618,7 +6676,7 @@
           <w:p>
             <w:pPr>
               <w:pStyle w:val="Compact"/>
-              <w:spacing w:before="0" w:after="0" w:line="259" w:lineRule="auto"/>
+              <w:spacing w:before="0" w:after="0"/>
             </w:pPr>
             <w:r>
               <w:rPr>
@@ -6650,7 +6708,7 @@
           <w:p>
             <w:pPr>
               <w:pStyle w:val="Compact"/>
-              <w:spacing w:before="0" w:after="0" w:line="259" w:lineRule="auto"/>
+              <w:spacing w:before="0" w:after="0"/>
             </w:pPr>
             <w:r>
               <w:rPr>
@@ -6688,8 +6746,8 @@
         <w:t xml:space="preserve">row: who, when, and which lot.</w:t>
       </w:r>
     </w:p>
-    <w:bookmarkEnd w:id="22"/>
-    <w:bookmarkStart w:id="23" w:name="database-rules"/>
+    <w:bookmarkEnd w:id="34"/>
+    <w:bookmarkStart w:id="35" w:name="database-rules"/>
     <w:p>
       <w:pPr>
         <w:pStyle w:val="Heading2"/>
@@ -6872,8 +6930,8 @@
         <w:t xml:space="preserve">is updated only by the transaction that inserted the event.</w:t>
       </w:r>
     </w:p>
-    <w:bookmarkEnd w:id="23"/>
-    <w:bookmarkStart w:id="24" w:name="authorization"/>
+    <w:bookmarkEnd w:id="35"/>
+    <w:bookmarkStart w:id="36" w:name="authorization"/>
     <w:p>
       <w:pPr>
         <w:pStyle w:val="Heading2"/>
@@ -6920,7 +6978,7 @@
           <w:p>
             <w:pPr>
               <w:pStyle w:val="Compact"/>
-              <w:spacing w:before="0" w:after="0" w:line="259" w:lineRule="auto"/>
+              <w:spacing w:before="0" w:after="0"/>
             </w:pPr>
             <w:r>
               <w:rPr>
@@ -6952,7 +7010,7 @@
           <w:p>
             <w:pPr>
               <w:pStyle w:val="Compact"/>
-              <w:spacing w:before="0" w:after="0" w:line="259" w:lineRule="auto"/>
+              <w:spacing w:before="0" w:after="0"/>
             </w:pPr>
             <w:r>
               <w:rPr>
@@ -6984,7 +7042,7 @@
           <w:p>
             <w:pPr>
               <w:pStyle w:val="Compact"/>
-              <w:spacing w:before="0" w:after="0" w:line="259" w:lineRule="auto"/>
+              <w:spacing w:before="0" w:after="0"/>
             </w:pPr>
             <w:r>
               <w:rPr>
@@ -7016,7 +7074,7 @@
           <w:p>
             <w:pPr>
               <w:pStyle w:val="Compact"/>
-              <w:spacing w:before="0" w:after="0" w:line="259" w:lineRule="auto"/>
+              <w:spacing w:before="0" w:after="0"/>
             </w:pPr>
             <w:r>
               <w:rPr>
@@ -7048,7 +7106,7 @@
           <w:p>
             <w:pPr>
               <w:pStyle w:val="Compact"/>
-              <w:spacing w:before="0" w:after="0" w:line="259" w:lineRule="auto"/>
+              <w:spacing w:before="0" w:after="0"/>
             </w:pPr>
             <w:r>
               <w:rPr>
@@ -7080,7 +7138,7 @@
           <w:p>
             <w:pPr>
               <w:pStyle w:val="Compact"/>
-              <w:spacing w:before="0" w:after="0" w:line="259" w:lineRule="auto"/>
+              <w:spacing w:before="0" w:after="0"/>
             </w:pPr>
             <w:r>
               <w:rPr>
@@ -7114,7 +7172,7 @@
           <w:p>
             <w:pPr>
               <w:pStyle w:val="Compact"/>
-              <w:spacing w:before="0" w:after="0" w:line="259" w:lineRule="auto"/>
+              <w:spacing w:before="0" w:after="0"/>
             </w:pPr>
             <w:r>
               <w:rPr>
@@ -7146,7 +7204,7 @@
           <w:p>
             <w:pPr>
               <w:pStyle w:val="Compact"/>
-              <w:spacing w:before="0" w:after="0" w:line="259" w:lineRule="auto"/>
+              <w:spacing w:before="0" w:after="0"/>
             </w:pPr>
             <w:r>
               <w:rPr>
@@ -7178,7 +7236,7 @@
           <w:p>
             <w:pPr>
               <w:pStyle w:val="Compact"/>
-              <w:spacing w:before="0" w:after="0" w:line="259" w:lineRule="auto"/>
+              <w:spacing w:before="0" w:after="0"/>
             </w:pPr>
             <w:r>
               <w:rPr>
@@ -7210,7 +7268,7 @@
           <w:p>
             <w:pPr>
               <w:pStyle w:val="Compact"/>
-              <w:spacing w:before="0" w:after="0" w:line="259" w:lineRule="auto"/>
+              <w:spacing w:before="0" w:after="0"/>
             </w:pPr>
             <w:r>
               <w:rPr>
@@ -7242,7 +7300,7 @@
           <w:p>
             <w:pPr>
               <w:pStyle w:val="Compact"/>
-              <w:spacing w:before="0" w:after="0" w:line="259" w:lineRule="auto"/>
+              <w:spacing w:before="0" w:after="0"/>
             </w:pPr>
             <w:r>
               <w:rPr>
@@ -7274,7 +7332,7 @@
           <w:p>
             <w:pPr>
               <w:pStyle w:val="Compact"/>
-              <w:spacing w:before="0" w:after="0" w:line="259" w:lineRule="auto"/>
+              <w:spacing w:before="0" w:after="0"/>
             </w:pPr>
             <w:r>
               <w:rPr>
@@ -7308,7 +7366,7 @@
           <w:p>
             <w:pPr>
               <w:pStyle w:val="Compact"/>
-              <w:spacing w:before="0" w:after="0" w:line="259" w:lineRule="auto"/>
+              <w:spacing w:before="0" w:after="0"/>
             </w:pPr>
             <w:r>
               <w:rPr>
@@ -7340,7 +7398,7 @@
           <w:p>
             <w:pPr>
               <w:pStyle w:val="Compact"/>
-              <w:spacing w:before="0" w:after="0" w:line="259" w:lineRule="auto"/>
+              <w:spacing w:before="0" w:after="0"/>
             </w:pPr>
             <w:r>
               <w:rPr>
@@ -7372,7 +7430,7 @@
           <w:p>
             <w:pPr>
               <w:pStyle w:val="Compact"/>
-              <w:spacing w:before="0" w:after="0" w:line="259" w:lineRule="auto"/>
+              <w:spacing w:before="0" w:after="0"/>
             </w:pPr>
             <w:r>
               <w:rPr>
@@ -7404,7 +7462,7 @@
           <w:p>
             <w:pPr>
               <w:pStyle w:val="Compact"/>
-              <w:spacing w:before="0" w:after="0" w:line="259" w:lineRule="auto"/>
+              <w:spacing w:before="0" w:after="0"/>
             </w:pPr>
             <w:r>
               <w:rPr>
@@ -7436,7 +7494,7 @@
           <w:p>
             <w:pPr>
               <w:pStyle w:val="Compact"/>
-              <w:spacing w:before="0" w:after="0" w:line="259" w:lineRule="auto"/>
+              <w:spacing w:before="0" w:after="0"/>
             </w:pPr>
             <w:r>
               <w:rPr>
@@ -7468,7 +7526,7 @@
           <w:p>
             <w:pPr>
               <w:pStyle w:val="Compact"/>
-              <w:spacing w:before="0" w:after="0" w:line="259" w:lineRule="auto"/>
+              <w:spacing w:before="0" w:after="0"/>
             </w:pPr>
             <w:r>
               <w:rPr>
@@ -7502,7 +7560,7 @@
           <w:p>
             <w:pPr>
               <w:pStyle w:val="Compact"/>
-              <w:spacing w:before="0" w:after="0" w:line="259" w:lineRule="auto"/>
+              <w:spacing w:before="0" w:after="0"/>
             </w:pPr>
             <w:r>
               <w:rPr>
@@ -7534,7 +7592,7 @@
           <w:p>
             <w:pPr>
               <w:pStyle w:val="Compact"/>
-              <w:spacing w:before="0" w:after="0" w:line="259" w:lineRule="auto"/>
+              <w:spacing w:before="0" w:after="0"/>
             </w:pPr>
             <w:r>
               <w:rPr>
@@ -7566,7 +7624,7 @@
           <w:p>
             <w:pPr>
               <w:pStyle w:val="Compact"/>
-              <w:spacing w:before="0" w:after="0" w:line="259" w:lineRule="auto"/>
+              <w:spacing w:before="0" w:after="0"/>
             </w:pPr>
             <w:r>
               <w:rPr>
@@ -7598,7 +7656,7 @@
           <w:p>
             <w:pPr>
               <w:pStyle w:val="Compact"/>
-              <w:spacing w:before="0" w:after="0" w:line="259" w:lineRule="auto"/>
+              <w:spacing w:before="0" w:after="0"/>
             </w:pPr>
             <w:r>
               <w:rPr>
@@ -7630,7 +7688,7 @@
           <w:p>
             <w:pPr>
               <w:pStyle w:val="Compact"/>
-              <w:spacing w:before="0" w:after="0" w:line="259" w:lineRule="auto"/>
+              <w:spacing w:before="0" w:after="0"/>
             </w:pPr>
             <w:r>
               <w:rPr>
@@ -7662,7 +7720,7 @@
           <w:p>
             <w:pPr>
               <w:pStyle w:val="Compact"/>
-              <w:spacing w:before="0" w:after="0" w:line="259" w:lineRule="auto"/>
+              <w:spacing w:before="0" w:after="0"/>
             </w:pPr>
             <w:r>
               <w:rPr>
@@ -7696,7 +7754,7 @@
           <w:p>
             <w:pPr>
               <w:pStyle w:val="Compact"/>
-              <w:spacing w:before="0" w:after="0" w:line="259" w:lineRule="auto"/>
+              <w:spacing w:before="0" w:after="0"/>
             </w:pPr>
             <w:r>
               <w:rPr>
@@ -7728,7 +7786,7 @@
           <w:p>
             <w:pPr>
               <w:pStyle w:val="Compact"/>
-              <w:spacing w:before="0" w:after="0" w:line="259" w:lineRule="auto"/>
+              <w:spacing w:before="0" w:after="0"/>
             </w:pPr>
             <w:r>
               <w:rPr>
@@ -7760,7 +7818,7 @@
           <w:p>
             <w:pPr>
               <w:pStyle w:val="Compact"/>
-              <w:spacing w:before="0" w:after="0" w:line="259" w:lineRule="auto"/>
+              <w:spacing w:before="0" w:after="0"/>
             </w:pPr>
             <w:r>
               <w:rPr>
@@ -7792,7 +7850,7 @@
           <w:p>
             <w:pPr>
               <w:pStyle w:val="Compact"/>
-              <w:spacing w:before="0" w:after="0" w:line="259" w:lineRule="auto"/>
+              <w:spacing w:before="0" w:after="0"/>
             </w:pPr>
             <w:r>
               <w:rPr>
@@ -7824,7 +7882,7 @@
           <w:p>
             <w:pPr>
               <w:pStyle w:val="Compact"/>
-              <w:spacing w:before="0" w:after="0" w:line="259" w:lineRule="auto"/>
+              <w:spacing w:before="0" w:after="0"/>
             </w:pPr>
             <w:r>
               <w:rPr>
@@ -7856,7 +7914,7 @@
           <w:p>
             <w:pPr>
               <w:pStyle w:val="Compact"/>
-              <w:spacing w:before="0" w:after="0" w:line="259" w:lineRule="auto"/>
+              <w:spacing w:before="0" w:after="0"/>
             </w:pPr>
             <w:r>
               <w:rPr>
@@ -7890,7 +7948,7 @@
           <w:p>
             <w:pPr>
               <w:pStyle w:val="Compact"/>
-              <w:spacing w:before="0" w:after="0" w:line="259" w:lineRule="auto"/>
+              <w:spacing w:before="0" w:after="0"/>
             </w:pPr>
             <w:r>
               <w:rPr>
@@ -7922,7 +7980,7 @@
           <w:p>
             <w:pPr>
               <w:pStyle w:val="Compact"/>
-              <w:spacing w:before="0" w:after="0" w:line="259" w:lineRule="auto"/>
+              <w:spacing w:before="0" w:after="0"/>
             </w:pPr>
             <w:r>
               <w:rPr>
@@ -7954,7 +8012,7 @@
           <w:p>
             <w:pPr>
               <w:pStyle w:val="Compact"/>
-              <w:spacing w:before="0" w:after="0" w:line="259" w:lineRule="auto"/>
+              <w:spacing w:before="0" w:after="0"/>
             </w:pPr>
             <w:r>
               <w:rPr>
@@ -7986,7 +8044,7 @@
           <w:p>
             <w:pPr>
               <w:pStyle w:val="Compact"/>
-              <w:spacing w:before="0" w:after="0" w:line="259" w:lineRule="auto"/>
+              <w:spacing w:before="0" w:after="0"/>
             </w:pPr>
             <w:r>
               <w:rPr>
@@ -8018,7 +8076,7 @@
           <w:p>
             <w:pPr>
               <w:pStyle w:val="Compact"/>
-              <w:spacing w:before="0" w:after="0" w:line="259" w:lineRule="auto"/>
+              <w:spacing w:before="0" w:after="0"/>
             </w:pPr>
             <w:r>
               <w:rPr>
@@ -8050,7 +8108,7 @@
           <w:p>
             <w:pPr>
               <w:pStyle w:val="Compact"/>
-              <w:spacing w:before="0" w:after="0" w:line="259" w:lineRule="auto"/>
+              <w:spacing w:before="0" w:after="0"/>
             </w:pPr>
             <w:r>
               <w:rPr>
@@ -8073,9 +8131,135 @@
         <w:t xml:space="preserve">A clerk can sign only with the key of their own organization, and only for a lot that organization currently holds. Harvest is the exception: it creates the lot.</w:t>
       </w:r>
     </w:p>
-    <w:bookmarkEnd w:id="24"/>
-    <w:bookmarkEnd w:id="25"/>
-    <w:bookmarkStart w:id="32" w:name="mvp-roadmap"/>
+    <w:p>
+      <w:pPr>
+        <w:pStyle w:val="BodyText"/>
+      </w:pPr>
+      <w:r>
+        <w:t xml:space="preserve">That table is the cashew seed, not the authorization model. A profile grants capabilities (</w:t>
+      </w:r>
+      <w:r>
+        <w:rPr>
+          <w:rStyle w:val="VerbatimChar"/>
+        </w:rPr>
+        <w:t xml:space="preserve">write:harvest</w:t>
+      </w:r>
+      <w:r>
+        <w:t xml:space="preserve">,</w:t>
+      </w:r>
+      <w:r>
+        <w:t xml:space="preserve"> </w:t>
+      </w:r>
+      <w:r>
+        <w:rPr>
+          <w:rStyle w:val="VerbatimChar"/>
+        </w:rPr>
+        <w:t xml:space="preserve">write:process</w:t>
+      </w:r>
+      <w:r>
+        <w:t xml:space="preserve">,</w:t>
+      </w:r>
+      <w:r>
+        <w:t xml:space="preserve"> </w:t>
+      </w:r>
+      <w:r>
+        <w:rPr>
+          <w:rStyle w:val="VerbatimChar"/>
+        </w:rPr>
+        <w:t xml:space="preserve">read:grams</w:t>
+      </w:r>
+      <w:r>
+        <w:t xml:space="preserve">,</w:t>
+      </w:r>
+      <w:r>
+        <w:t xml:space="preserve"> </w:t>
+      </w:r>
+      <w:r>
+        <w:rPr>
+          <w:rStyle w:val="VerbatimChar"/>
+        </w:rPr>
+        <w:t xml:space="preserve">open:audit</w:t>
+      </w:r>
+      <w:r>
+        <w:t xml:space="preserve">) to an organization kind. The API checks the capability. A lab or a port agent is a new grant, not a new column.</w:t>
+      </w:r>
+    </w:p>
+    <w:bookmarkEnd w:id="36"/>
+    <w:bookmarkEnd w:id="37"/>
+    <w:bookmarkStart w:id="41" w:name="kernel-and-configuration"/>
+    <w:p>
+      <w:pPr>
+        <w:pStyle w:val="Heading1"/>
+      </w:pPr>
+      <w:r>
+        <w:t xml:space="preserve">Kernel and configuration</w:t>
+      </w:r>
+    </w:p>
+    <w:p>
+      <w:pPr>
+        <w:pStyle w:val="FirstParagraph"/>
+      </w:pPr>
+      <w:r>
+        <w:t xml:space="preserve">Lots, events, and claims stay generic. Cashew settings live in seed data: profile, corridor, bands, merge policy, claim fields, enabled checks, and capability grants. The harvest handler does not contain a commodity name or an origin country. A later concern adds a module and rows, as set out in the modularity QA.</w:t>
+      </w:r>
+    </w:p>
+    <w:p>
+      <w:pPr>
+        <w:pStyle w:val="CaptionedFigure"/>
+      </w:pPr>
+      <w:r>
+        <w:drawing>
+          <wp:inline>
+            <wp:extent cx="5334000" cy="3615266"/>
+            <wp:effectExtent b="0" l="0" r="0" t="0"/>
+            <wp:docPr descr="Kernel, and the modules that are on for cashew or left for later" title="" id="39" name="Picture"/>
+            <a:graphic>
+              <a:graphicData uri="http://schemas.openxmlformats.org/drawingml/2006/picture">
+                <pic:pic>
+                  <pic:nvPicPr>
+                    <pic:cNvPr descr="diagrams/modules.png" id="40" name="Picture"/>
+                    <pic:cNvPicPr>
+                      <a:picLocks noChangeArrowheads="1" noChangeAspect="1"/>
+                    </pic:cNvPicPr>
+                  </pic:nvPicPr>
+                  <pic:blipFill>
+                    <a:blip r:embed="rId38"/>
+                    <a:stretch>
+                      <a:fillRect/>
+                    </a:stretch>
+                  </pic:blipFill>
+                  <pic:spPr bwMode="auto">
+                    <a:xfrm>
+                      <a:off x="0" y="0"/>
+                      <a:ext cx="5334000" cy="3615266"/>
+                    </a:xfrm>
+                    <a:prstGeom prst="rect">
+                      <a:avLst/>
+                    </a:prstGeom>
+                    <a:noFill/>
+                    <a:ln w="9525">
+                      <a:noFill/>
+                      <a:headEnd/>
+                      <a:tailEnd/>
+                    </a:ln>
+                  </pic:spPr>
+                </pic:pic>
+              </a:graphicData>
+            </a:graphic>
+          </wp:inline>
+        </w:drawing>
+      </w:r>
+    </w:p>
+    <w:p>
+      <w:pPr>
+        <w:pStyle w:val="ImageCaption"/>
+      </w:pPr>
+      <w:r>
+        <w:t xml:space="preserve">Kernel, and the modules that are on for cashew or left for later</w:t>
+      </w:r>
+    </w:p>
+    <w:bookmarkEnd w:id="41"/>
+    <w:bookmarkStart w:id="48" w:name="mvp-roadmap"/>
     <w:p>
       <w:pPr>
         <w:pStyle w:val="Heading1"/>
@@ -8093,7 +8277,7 @@
         <w:t xml:space="preserve">Phases are sequential. A phase is done when its exit checks pass, not when the screens exist. Dates wait until a pilot coop and a plant are named.</w:t>
       </w:r>
     </w:p>
-    <w:bookmarkStart w:id="26" w:name="phase-1-parcel-and-harvest"/>
+    <w:bookmarkStart w:id="42" w:name="phase-1-parcel-and-harvest"/>
     <w:p>
       <w:pPr>
         <w:pStyle w:val="Heading2"/>
@@ -8187,8 +8371,20 @@
         <w:t xml:space="preserve">The grower has no user account.</w:t>
       </w:r>
     </w:p>
-    <w:bookmarkEnd w:id="26"/>
-    <w:bookmarkStart w:id="27" w:name="phase-2-named-merges"/>
+    <w:p>
+      <w:pPr>
+        <w:pStyle w:val="Compact"/>
+        <w:numPr>
+          <w:ilvl w:val="0"/>
+          <w:numId w:val="1004"/>
+        </w:numPr>
+      </w:pPr>
+      <w:r>
+        <w:t xml:space="preserve">The harvest path reads the cashew profile from configuration. It does not hard-code the commodity or the origin country.</w:t>
+      </w:r>
+    </w:p>
+    <w:bookmarkEnd w:id="42"/>
+    <w:bookmarkStart w:id="43" w:name="phase-2-named-merges"/>
     <w:p>
       <w:pPr>
         <w:pStyle w:val="Heading2"/>
@@ -8273,11 +8469,23 @@
         </w:numPr>
       </w:pPr>
       <w:r>
-        <w:t xml:space="preserve">The output lot’s biological origin is Côte d’Ivoire, copied from the inputs. Mixed-origin merges are rejected in the MVP.</w:t>
-      </w:r>
-    </w:p>
-    <w:bookmarkEnd w:id="27"/>
-    <w:bookmarkStart w:id="28" w:name="phase-3-load-and-process"/>
+        <w:t xml:space="preserve">The output lot’s biological origin is copied from the inputs.</w:t>
+      </w:r>
+    </w:p>
+    <w:p>
+      <w:pPr>
+        <w:pStyle w:val="Compact"/>
+        <w:numPr>
+          <w:ilvl w:val="0"/>
+          <w:numId w:val="1005"/>
+        </w:numPr>
+      </w:pPr>
+      <w:r>
+        <w:t xml:space="preserve">The cashew profile rejects a mixed-origin merge. The test fixture uses Côte d’Ivoire. The merge code does not.</w:t>
+      </w:r>
+    </w:p>
+    <w:bookmarkEnd w:id="43"/>
+    <w:bookmarkStart w:id="44" w:name="phase-3-load-and-process"/>
     <w:p>
       <w:pPr>
         <w:pStyle w:val="Heading2"/>
@@ -8311,7 +8519,7 @@
         </w:numPr>
       </w:pPr>
       <w:r>
-        <w:t xml:space="preserve">The process country is stored and is different from biological origin when the plant is abroad.</w:t>
+        <w:t xml:space="preserve">The process country is stored beside biological origin. The pilot plant is abroad. A profile may process at home.</w:t>
       </w:r>
     </w:p>
     <w:p>
@@ -8338,8 +8546,8 @@
         <w:t xml:space="preserve">The plant cannot process a lot it does not hold.</w:t>
       </w:r>
     </w:p>
-    <w:bookmarkEnd w:id="28"/>
-    <w:bookmarkStart w:id="29" w:name="phase-4-claim"/>
+    <w:bookmarkEnd w:id="44"/>
+    <w:bookmarkStart w:id="45" w:name="phase-4-claim"/>
     <w:p>
       <w:pPr>
         <w:pStyle w:val="Heading2"/>
@@ -8400,8 +8608,8 @@
         <w:t xml:space="preserve">A relabel with a later expiry leaves the packing expiry on the claim and opens an alert.</w:t>
       </w:r>
     </w:p>
-    <w:bookmarkEnd w:id="29"/>
-    <w:bookmarkStart w:id="30" w:name="phase-5-authority-and-audit"/>
+    <w:bookmarkEnd w:id="45"/>
+    <w:bookmarkStart w:id="46" w:name="phase-5-authority-and-audit"/>
     <w:p>
       <w:pPr>
         <w:pStyle w:val="Heading2"/>
@@ -8462,8 +8670,8 @@
         <w:t xml:space="preserve">A buyer sees the claim, the last inspection result, and the band.</w:t>
       </w:r>
     </w:p>
-    <w:bookmarkEnd w:id="30"/>
-    <w:bookmarkStart w:id="31" w:name="after-the-mvp"/>
+    <w:bookmarkEnd w:id="46"/>
+    <w:bookmarkStart w:id="47" w:name="after-the-mvp"/>
     <w:p>
       <w:pPr>
         <w:pStyle w:val="Heading2"/>
@@ -8576,9 +8784,9 @@
         <w:t xml:space="preserve">A permissioned ledger for the hash chain, if a second operator refuses this database. The event JSON stays the same so the log can move.</w:t>
       </w:r>
     </w:p>
-    <w:bookmarkEnd w:id="31"/>
-    <w:bookmarkEnd w:id="32"/>
-    <w:bookmarkStart w:id="33" w:name="out-of-scope"/>
+    <w:bookmarkEnd w:id="47"/>
+    <w:bookmarkEnd w:id="48"/>
+    <w:bookmarkStart w:id="49" w:name="out-of-scope"/>
     <w:p>
       <w:pPr>
         <w:pStyle w:val="Heading1"/>
@@ -8671,8 +8879,8 @@
         <w:t xml:space="preserve">Multi-region deployment and a mobile app.</w:t>
       </w:r>
     </w:p>
-    <w:bookmarkEnd w:id="33"/>
-    <w:bookmarkStart w:id="34" w:name="how-this-stays-honest"/>
+    <w:bookmarkEnd w:id="49"/>
+    <w:bookmarkStart w:id="50" w:name="how-this-stays-honest"/>
     <w:p>
       <w:pPr>
         <w:pStyle w:val="Heading1"/>
@@ -8689,12 +8897,12 @@
         <w:t xml:space="preserve">The operator can refuse to publish, and can go offline. The operator cannot silently rewrite a history that other parties have already verified, because those parties hold the signatures and the hashes. That is the custody property this MVP owes. It is not a claim that a cartel is inside the database. When an alert fires, the trail leaves this system and goes to people who investigate companies and accounts.</w:t>
       </w:r>
     </w:p>
-    <w:bookmarkEnd w:id="34"/>
+    <w:bookmarkEnd w:id="50"/>
     <w:sectPr>
       <w:headerReference w:type="default" r:id="rId9"/>
       <w:footerReference w:type="default" r:id="rId10"/>
-      <w:headerReference w:type="first" r:id="rId11"/>
-      <w:footerReference w:type="first" r:id="rId12"/>
+      <w:headerReference w:type="first" r:id="rId12"/>
+      <w:footerReference w:type="first" r:id="rId13"/>
       <w:footnotePr>
         <w:numRestart w:val="eachSect"/>
       </w:footnotePr>

</xml_diff>

<commit_message>
Write down where this stands before putting it away
Everything needed to pick this up again is in the repository now, not in
a chat log.

docs/state.md says what exists, which four decisions are settled and
where their reasoning lives, what to do next, and which rough edges in
the mockups are deliberate so they are not rediscovered as bugs.

The scripts that rebuild the diagrams and the Word document have been
living in /tmp and have been lost twice. They are in tools/ now, with
paths resolved from their own location rather than hardcoded, and
tools/README.md records the things that cost time to work out: pandoc
drops every figure caption under gfm, headless Chrome writes no file and
reports no error inside a sandbox, and zsh will not word-split an
unquoted parameter.

Rebuilt the Word document while confirming the scripts still run from
their new home, so it now carries the flow-control section.

Co-authored-by: Cursor <cursoragent@cursor.com>
</commit_message>
<xml_diff>
--- a/docs/agriChain Solution Blueprint.docx
+++ b/docs/agriChain Solution Blueprint.docx
@@ -270,6 +270,20 @@
           <w:sz w:val="22"/>
         </w:rPr>
         <w:t>Alerts survive a merge</w:t>
+      </w:r>
+    </w:p>
+    <w:p>
+      <w:pPr>
+        <w:spacing w:after="20"/>
+      </w:pPr>
+      <w:r>
+        <w:rPr>
+          <w:rFonts w:ascii="Calibri" w:hAnsi="Calibri"/>
+          <w:b w:val="0"/>
+          <w:color w:val="52636B"/>
+          <w:sz w:val="22"/>
+        </w:rPr>
+        <w:t>After the checks</w:t>
       </w:r>
     </w:p>
     <w:p>
@@ -1477,7 +1491,7 @@
     </w:p>
     <w:bookmarkEnd w:id="21"/>
     <w:bookmarkEnd w:id="22"/>
-    <w:bookmarkStart w:id="29" w:name="domain-model"/>
+    <w:bookmarkStart w:id="31" w:name="domain-model"/>
     <w:p>
       <w:pPr>
         <w:pStyle w:val="Heading1"/>
@@ -3195,7 +3209,7 @@
       </w:r>
     </w:p>
     <w:bookmarkEnd w:id="25"/>
-    <w:bookmarkStart w:id="26" w:name="claims-and-bands"/>
+    <w:bookmarkStart w:id="27" w:name="claims-and-bands"/>
     <w:p>
       <w:pPr>
         <w:pStyle w:val="Heading2"/>
@@ -3362,10 +3376,19 @@
               <w:t xml:space="preserve">clear</w:t>
             </w:r>
             <w:r>
+              <w:t xml:space="preserve">,</w:t>
+            </w:r>
+            <w:r>
               <w:t xml:space="preserve"> </w:t>
             </w:r>
             <w:r>
-              <w:t xml:space="preserve">or</w:t>
+              <w:rPr>
+                <w:rStyle w:val="VerbatimChar"/>
+              </w:rPr>
+              <w:t xml:space="preserve">awaiting countersign</w:t>
+            </w:r>
+            <w:r>
+              <w:t xml:space="preserve">, or</w:t>
             </w:r>
             <w:r>
               <w:t xml:space="preserve"> </w:t>
@@ -3389,6 +3412,20 @@
               <w:t xml:space="preserve">alert</w:t>
             </w:r>
             <w:r>
+              <w:t xml:space="preserve">. The three come from the dispositions in</w:t>
+            </w:r>
+            <w:r>
+              <w:t xml:space="preserve"> </w:t>
+            </w:r>
+            <w:hyperlink r:id="rId26">
+              <w:r>
+                <w:rPr>
+                  <w:rStyle w:val="Hyperlink"/>
+                </w:rPr>
+                <w:t xml:space="preserve">flow-control.md</w:t>
+              </w:r>
+            </w:hyperlink>
+            <w:r>
               <w:t xml:space="preserve">.</w:t>
             </w:r>
           </w:p>
@@ -3481,8 +3518,8 @@
         <w:t xml:space="preserve">The buyer and the public page receive the band. The coop, the plant, and an opened audit receive grams.</w:t>
       </w:r>
     </w:p>
-    <w:bookmarkEnd w:id="26"/>
-    <w:bookmarkStart w:id="27" w:name="rejected-writes-and-opened-alerts"/>
+    <w:bookmarkEnd w:id="27"/>
+    <w:bookmarkStart w:id="28" w:name="rejected-writes-and-opened-alerts"/>
     <w:p>
       <w:pPr>
         <w:pStyle w:val="Heading2"/>
@@ -3931,8 +3968,8 @@
         <w:t xml:space="preserve">The tolerance is a profile value in grams or basis points, not a constant in the handler. Cashew drying loses weight between the farm gate and the intake scale, and a corridor that weighs wet nuts needs a different number than one that weighs dry.</w:t>
       </w:r>
     </w:p>
-    <w:bookmarkEnd w:id="27"/>
-    <w:bookmarkStart w:id="28" w:name="alerts-survive-a-merge"/>
+    <w:bookmarkEnd w:id="28"/>
+    <w:bookmarkStart w:id="29" w:name="alerts-survive-a-merge"/>
     <w:p>
       <w:pPr>
         <w:pStyle w:val="Heading2"/>
@@ -4030,9 +4067,282 @@
         <w:t xml:space="preserve">Closing the source alert does not rewrite the inherited row. It records the resolution beside it.</w:t>
       </w:r>
     </w:p>
-    <w:bookmarkEnd w:id="28"/>
     <w:bookmarkEnd w:id="29"/>
-    <w:bookmarkStart w:id="46" w:name="technical-architecture"/>
+    <w:bookmarkStart w:id="30" w:name="after-the-checks"/>
+    <w:p>
+      <w:pPr>
+        <w:pStyle w:val="Heading2"/>
+      </w:pPr>
+      <w:r>
+        <w:t xml:space="preserve">After the checks</w:t>
+      </w:r>
+    </w:p>
+    <w:p>
+      <w:pPr>
+        <w:pStyle w:val="FirstParagraph"/>
+      </w:pPr>
+      <w:r>
+        <w:t xml:space="preserve">Three dispositions, chosen per event type by the profile rather than by the handler. The rule behind them is that the event is never gated, only the claim. A signed event waiting in an approval queue is a true thing the record does not say, which is the opacity this system exists to remove. The reasoning is in</w:t>
+      </w:r>
+      <w:r>
+        <w:t xml:space="preserve"> </w:t>
+      </w:r>
+      <w:hyperlink r:id="rId26">
+        <w:r>
+          <w:rPr>
+            <w:rStyle w:val="Hyperlink"/>
+          </w:rPr>
+          <w:t xml:space="preserve">flow-control.md</w:t>
+        </w:r>
+      </w:hyperlink>
+      <w:r>
+        <w:t xml:space="preserve">.</w:t>
+      </w:r>
+    </w:p>
+    <w:tbl>
+      <w:tblPr>
+        <w:tblStyle w:val="Table"/>
+        <w:tblW w:type="pct" w:w="5000"/>
+        <w:tblLayout w:type="fixed"/>
+        <w:tblLook w:firstRow="1" w:lastRow="0" w:firstColumn="0" w:lastColumn="0" w:noHBand="0" w:noVBand="0" w:val="0020"/>
+      </w:tblPr>
+      <w:tblGrid>
+        <w:gridCol w:w="2640"/>
+        <w:gridCol w:w="2640"/>
+        <w:gridCol w:w="2640"/>
+      </w:tblGrid>
+      <w:tr>
+        <w:trPr>
+          <w:tblHeader w:val="on"/>
+        </w:trPr>
+        <w:tc>
+          <w:tcPr/>
+          <w:p>
+            <w:pPr>
+              <w:pStyle w:val="Compact"/>
+            </w:pPr>
+            <w:r>
+              <w:t xml:space="preserve">Disposition</w:t>
+            </w:r>
+          </w:p>
+        </w:tc>
+        <w:tc>
+          <w:tcPr/>
+          <w:p>
+            <w:pPr>
+              <w:pStyle w:val="Compact"/>
+            </w:pPr>
+            <w:r>
+              <w:t xml:space="preserve">Claim reads</w:t>
+            </w:r>
+          </w:p>
+        </w:tc>
+        <w:tc>
+          <w:tcPr/>
+          <w:p>
+            <w:pPr>
+              <w:pStyle w:val="Compact"/>
+            </w:pPr>
+            <w:r>
+              <w:t xml:space="preserve">Next step</w:t>
+            </w:r>
+          </w:p>
+        </w:tc>
+      </w:tr>
+      <w:tr>
+        <w:tc>
+          <w:tcPr/>
+          <w:p>
+            <w:pPr>
+              <w:pStyle w:val="Compact"/>
+            </w:pPr>
+            <w:r>
+              <w:t xml:space="preserve">Auto-advance</w:t>
+            </w:r>
+          </w:p>
+        </w:tc>
+        <w:tc>
+          <w:tcPr/>
+          <w:p>
+            <w:pPr>
+              <w:pStyle w:val="Compact"/>
+            </w:pPr>
+            <w:r>
+              <w:rPr>
+                <w:rStyle w:val="VerbatimChar"/>
+              </w:rPr>
+              <w:t xml:space="preserve">clear</w:t>
+            </w:r>
+          </w:p>
+        </w:tc>
+        <w:tc>
+          <w:tcPr/>
+          <w:p>
+            <w:pPr>
+              <w:pStyle w:val="Compact"/>
+            </w:pPr>
+            <w:r>
+              <w:t xml:space="preserve">Unlocked. No human in the way. The cashew pilot runs this way for every event type.</w:t>
+            </w:r>
+          </w:p>
+        </w:tc>
+      </w:tr>
+      <w:tr>
+        <w:tc>
+          <w:tcPr/>
+          <w:p>
+            <w:pPr>
+              <w:pStyle w:val="Compact"/>
+            </w:pPr>
+            <w:r>
+              <w:t xml:space="preserve">Alert</w:t>
+            </w:r>
+          </w:p>
+        </w:tc>
+        <w:tc>
+          <w:tcPr/>
+          <w:p>
+            <w:pPr>
+              <w:pStyle w:val="Compact"/>
+            </w:pPr>
+            <w:r>
+              <w:rPr>
+                <w:rStyle w:val="VerbatimChar"/>
+              </w:rPr>
+              <w:t xml:space="preserve">alert</w:t>
+            </w:r>
+          </w:p>
+        </w:tc>
+        <w:tc>
+          <w:tcPr/>
+          <w:p>
+            <w:pPr>
+              <w:pStyle w:val="Compact"/>
+            </w:pPr>
+            <w:r>
+              <w:t xml:space="preserve">Still unlocked. Holding goods that rot makes recording them a liability, so the alert travels with the lot instead.</w:t>
+            </w:r>
+          </w:p>
+        </w:tc>
+      </w:tr>
+      <w:tr>
+        <w:tc>
+          <w:tcPr/>
+          <w:p>
+            <w:pPr>
+              <w:pStyle w:val="Compact"/>
+            </w:pPr>
+            <w:r>
+              <w:t xml:space="preserve">Countersign required</w:t>
+            </w:r>
+          </w:p>
+        </w:tc>
+        <w:tc>
+          <w:tcPr/>
+          <w:p>
+            <w:pPr>
+              <w:pStyle w:val="Compact"/>
+            </w:pPr>
+            <w:r>
+              <w:rPr>
+                <w:rStyle w:val="VerbatimChar"/>
+              </w:rPr>
+              <w:t xml:space="preserve">awaiting countersign</w:t>
+            </w:r>
+          </w:p>
+        </w:tc>
+        <w:tc>
+          <w:tcPr/>
+          <w:p>
+            <w:pPr>
+              <w:pStyle w:val="Compact"/>
+            </w:pPr>
+            <w:r>
+              <w:t xml:space="preserve">Unlocked, but no reader sees</w:t>
+            </w:r>
+            <w:r>
+              <w:t xml:space="preserve"> </w:t>
+            </w:r>
+            <w:r>
+              <w:rPr>
+                <w:rStyle w:val="VerbatimChar"/>
+              </w:rPr>
+              <w:t xml:space="preserve">clear</w:t>
+            </w:r>
+            <w:r>
+              <w:t xml:space="preserve"> </w:t>
+            </w:r>
+            <w:r>
+              <w:t xml:space="preserve">until the second party signs.</w:t>
+            </w:r>
+          </w:p>
+        </w:tc>
+      </w:tr>
+    </w:tbl>
+    <w:p>
+      <w:pPr>
+        <w:pStyle w:val="BodyText"/>
+      </w:pPr>
+      <w:r>
+        <w:t xml:space="preserve">Countersign is an option for a high-value step, not the backbone, because</w:t>
+      </w:r>
+      <w:r>
+        <w:t xml:space="preserve"> </w:t>
+      </w:r>
+      <w:r>
+        <w:rPr>
+          <w:rStyle w:val="VerbatimChar"/>
+        </w:rPr>
+        <w:t xml:space="preserve">transfer</w:t>
+      </w:r>
+      <w:r>
+        <w:t xml:space="preserve"> </w:t>
+      </w:r>
+      <w:r>
+        <w:t xml:space="preserve">and</w:t>
+      </w:r>
+      <w:r>
+        <w:t xml:space="preserve"> </w:t>
+      </w:r>
+      <w:r>
+        <w:rPr>
+          <w:rStyle w:val="VerbatimChar"/>
+        </w:rPr>
+        <w:t xml:space="preserve">accept</w:t>
+      </w:r>
+      <w:r>
+        <w:t xml:space="preserve"> </w:t>
+      </w:r>
+      <w:r>
+        <w:t xml:space="preserve">already put two signatures on every handoff and they sit in organizations with opposing interests. A coop supervisor checking a coop clerk is a weaker control than the plant that has to pay for the weight and balance it against what it cracks.</w:t>
+      </w:r>
+    </w:p>
+    <w:p>
+      <w:pPr>
+        <w:pStyle w:val="BodyText"/>
+      </w:pPr>
+      <w:r>
+        <w:t xml:space="preserve">An alert is resolved by a signed record placed beside it, never by an edit.</w:t>
+      </w:r>
+      <w:r>
+        <w:t xml:space="preserve"> </w:t>
+      </w:r>
+      <w:r>
+        <w:rPr>
+          <w:rStyle w:val="VerbatimChar"/>
+        </w:rPr>
+        <w:t xml:space="preserve">resolve:alert</w:t>
+      </w:r>
+      <w:r>
+        <w:t xml:space="preserve"> </w:t>
+      </w:r>
+      <w:r>
+        <w:t xml:space="preserve">is granted to the origin authority and the auditor, not to the organization whose event raised the alert, so nobody clears their own alarm.</w:t>
+      </w:r>
+    </w:p>
+    <w:bookmarkEnd w:id="30"/>
+    <w:bookmarkEnd w:id="31"/>
+    <w:bookmarkStart w:id="48" w:name="technical-architecture"/>
     <w:p>
       <w:pPr>
         <w:pStyle w:val="Heading1"/>
@@ -4059,18 +4369,18 @@
           <wp:inline>
             <wp:extent cx="5333969" cy="2518818"/>
             <wp:effectExtent b="0" l="0" r="0" t="0"/>
-            <wp:docPr descr="Browser, API, kernel tables, and configuration" title="" id="31" name="Picture"/>
+            <wp:docPr descr="Browser, API, kernel tables, and configuration" title="" id="33" name="Picture"/>
             <a:graphic>
               <a:graphicData uri="http://schemas.openxmlformats.org/drawingml/2006/picture">
                 <pic:pic>
                   <pic:nvPicPr>
-                    <pic:cNvPr descr="diagrams/architecture.png" id="32" name="Picture"/>
+                    <pic:cNvPr descr="diagrams/architecture.png" id="34" name="Picture"/>
                     <pic:cNvPicPr>
                       <a:picLocks noChangeArrowheads="1" noChangeAspect="1"/>
                     </pic:cNvPicPr>
                   </pic:nvPicPr>
                   <pic:blipFill>
-                    <a:blip r:embed="rId30"/>
+                    <a:blip r:embed="rId32"/>
                     <a:stretch>
                       <a:fillRect/>
                     </a:stretch>
@@ -4113,7 +4423,7 @@
         <w:t xml:space="preserve">There is no worker, cache, or object store in the MVP. Document files stay with the party who holds them. The event stores the SHA-256 of the file.</w:t>
       </w:r>
     </w:p>
-    <w:bookmarkStart w:id="33" w:name="stack"/>
+    <w:bookmarkStart w:id="35" w:name="stack"/>
     <w:p>
       <w:pPr>
         <w:pStyle w:val="Heading2"/>
@@ -4481,8 +4791,8 @@
         <w:t xml:space="preserve">The private key is generated in the browser when an organization enrolls. It is encrypted with a passphrase the organization keeps. The server may store the ciphertext so a new clerk machine can download it. The server cannot decrypt it. Signing happens in the browser after the passphrase is entered.</w:t>
       </w:r>
     </w:p>
-    <w:bookmarkEnd w:id="33"/>
-    <w:bookmarkStart w:id="34" w:name="key-versions"/>
+    <w:bookmarkEnd w:id="35"/>
+    <w:bookmarkStart w:id="36" w:name="key-versions"/>
     <w:p>
       <w:pPr>
         <w:pStyle w:val="Heading2"/>
@@ -4678,8 +4988,8 @@
         <w:t xml:space="preserve">, which is why it belongs in the MVP even though no pilot organization will rotate during it.</w:t>
       </w:r>
     </w:p>
-    <w:bookmarkEnd w:id="34"/>
-    <w:bookmarkStart w:id="38" w:name="transparency-log"/>
+    <w:bookmarkEnd w:id="36"/>
+    <w:bookmarkStart w:id="40" w:name="transparency-log"/>
     <w:p>
       <w:pPr>
         <w:pStyle w:val="Heading2"/>
@@ -4719,18 +5029,18 @@
           <wp:inline>
             <wp:extent cx="5333969" cy="2585814"/>
             <wp:effectExtent b="0" l="0" r="0" t="0"/>
-            <wp:docPr descr="The event log, the Merkle tree, a signed tree head, and the organizations that counter-sign it" title="" id="36" name="Picture"/>
+            <wp:docPr descr="The event log, the Merkle tree, a signed tree head, and the organizations that counter-sign it" title="" id="38" name="Picture"/>
             <a:graphic>
               <a:graphicData uri="http://schemas.openxmlformats.org/drawingml/2006/picture">
                 <pic:pic>
                   <pic:nvPicPr>
-                    <pic:cNvPr descr="diagrams/transparency-log.png" id="37" name="Picture"/>
+                    <pic:cNvPr descr="diagrams/transparency-log.png" id="39" name="Picture"/>
                     <pic:cNvPicPr>
                       <a:picLocks noChangeArrowheads="1" noChangeAspect="1"/>
                     </pic:cNvPicPr>
                   </pic:nvPicPr>
                   <pic:blipFill>
-                    <a:blip r:embed="rId35"/>
+                    <a:blip r:embed="rId37"/>
                     <a:stretch>
                       <a:fillRect/>
                     </a:stretch>
@@ -5071,8 +5381,8 @@
         <w:t xml:space="preserve">is unaffected. The tree size does reveal how many events exist. That is accepted.</w:t>
       </w:r>
     </w:p>
-    <w:bookmarkEnd w:id="38"/>
-    <w:bookmarkStart w:id="42" w:name="write-path"/>
+    <w:bookmarkEnd w:id="40"/>
+    <w:bookmarkStart w:id="44" w:name="write-path"/>
     <w:p>
       <w:pPr>
         <w:pStyle w:val="Heading2"/>
@@ -5090,18 +5400,18 @@
           <wp:inline>
             <wp:extent cx="5333969" cy="667992"/>
             <wp:effectExtent b="0" l="0" r="0" t="0"/>
-            <wp:docPr descr="Session, event, signature, verification, refusal, store, and reply" title="" id="40" name="Picture"/>
+            <wp:docPr descr="Session, event, signature, verification, refusal, store, and reply" title="" id="42" name="Picture"/>
             <a:graphic>
               <a:graphicData uri="http://schemas.openxmlformats.org/drawingml/2006/picture">
                 <pic:pic>
                   <pic:nvPicPr>
-                    <pic:cNvPr descr="diagrams/write-path.png" id="41" name="Picture"/>
+                    <pic:cNvPr descr="diagrams/write-path.png" id="43" name="Picture"/>
                     <pic:cNvPicPr>
                       <a:picLocks noChangeArrowheads="1" noChangeAspect="1"/>
                     </pic:cNvPicPr>
                   </pic:nvPicPr>
                   <pic:blipFill>
-                    <a:blip r:embed="rId39"/>
+                    <a:blip r:embed="rId41"/>
                     <a:stretch>
                       <a:fillRect/>
                     </a:stretch>
@@ -5360,8 +5670,8 @@
         <w:t xml:space="preserve">. The client reloads the head and asks the clerk to submit again.</w:t>
       </w:r>
     </w:p>
-    <w:bookmarkEnd w:id="42"/>
-    <w:bookmarkStart w:id="43" w:name="read-path"/>
+    <w:bookmarkEnd w:id="44"/>
+    <w:bookmarkStart w:id="45" w:name="read-path"/>
     <w:p>
       <w:pPr>
         <w:pStyle w:val="Heading2"/>
@@ -5798,8 +6108,8 @@
         <w:t xml:space="preserve">row: who, when, and which lot.</w:t>
       </w:r>
     </w:p>
-    <w:bookmarkEnd w:id="43"/>
-    <w:bookmarkStart w:id="44" w:name="database-rules"/>
+    <w:bookmarkEnd w:id="45"/>
+    <w:bookmarkStart w:id="46" w:name="database-rules"/>
     <w:p>
       <w:pPr>
         <w:pStyle w:val="Heading2"/>
@@ -6171,8 +6481,8 @@
         <w:t xml:space="preserve">are insert-only. A head is never amended; a later head supersedes it.</w:t>
       </w:r>
     </w:p>
-    <w:bookmarkEnd w:id="44"/>
-    <w:bookmarkStart w:id="45" w:name="authorization"/>
+    <w:bookmarkEnd w:id="46"/>
+    <w:bookmarkStart w:id="47" w:name="authorization"/>
     <w:p>
       <w:pPr>
         <w:pStyle w:val="Heading2"/>
@@ -6845,6 +7155,18 @@
         <w:rPr>
           <w:rStyle w:val="VerbatimChar"/>
         </w:rPr>
+        <w:t xml:space="preserve">write:countersign</w:t>
+      </w:r>
+      <w:r>
+        <w:t xml:space="preserve">,</w:t>
+      </w:r>
+      <w:r>
+        <w:t xml:space="preserve"> </w:t>
+      </w:r>
+      <w:r>
+        <w:rPr>
+          <w:rStyle w:val="VerbatimChar"/>
+        </w:rPr>
         <w:t xml:space="preserve">read:grams</w:t>
       </w:r>
       <w:r>
@@ -6884,6 +7206,18 @@
         <w:t xml:space="preserve">open:audit</w:t>
       </w:r>
       <w:r>
+        <w:t xml:space="preserve">,</w:t>
+      </w:r>
+      <w:r>
+        <w:t xml:space="preserve"> </w:t>
+      </w:r>
+      <w:r>
+        <w:rPr>
+          <w:rStyle w:val="VerbatimChar"/>
+        </w:rPr>
+        <w:t xml:space="preserve">resolve:alert</w:t>
+      </w:r>
+      <w:r>
         <w:t xml:space="preserve">.</w:t>
       </w:r>
     </w:p>
@@ -6904,9 +7238,9 @@
         <w:t xml:space="preserve">has no capability. It is written by the server inside the merge and process transactions and is never accepted from a client. A lab or a port agent is a new grant, not a new column.</w:t>
       </w:r>
     </w:p>
-    <w:bookmarkEnd w:id="45"/>
-    <w:bookmarkEnd w:id="46"/>
-    <w:bookmarkStart w:id="51" w:name="kernel-and-configuration"/>
+    <w:bookmarkEnd w:id="47"/>
+    <w:bookmarkEnd w:id="48"/>
+    <w:bookmarkStart w:id="53" w:name="kernel-and-configuration"/>
     <w:p>
       <w:pPr>
         <w:pStyle w:val="Heading1"/>
@@ -6925,7 +7259,7 @@
       <w:r>
         <w:t xml:space="preserve"> </w:t>
       </w:r>
-      <w:hyperlink r:id="rId47">
+      <w:hyperlink r:id="rId49">
         <w:r>
           <w:rPr>
             <w:rStyle w:val="Hyperlink"/>
@@ -6946,18 +7280,18 @@
           <wp:inline>
             <wp:extent cx="5333969" cy="3615244"/>
             <wp:effectExtent b="0" l="0" r="0" t="0"/>
-            <wp:docPr descr="Kernel, and the modules that are on for cashew or left for later" title="" id="49" name="Picture"/>
+            <wp:docPr descr="Kernel, and the modules that are on for cashew or left for later" title="" id="51" name="Picture"/>
             <a:graphic>
               <a:graphicData uri="http://schemas.openxmlformats.org/drawingml/2006/picture">
                 <pic:pic>
                   <pic:nvPicPr>
-                    <pic:cNvPr descr="diagrams/modules.png" id="50" name="Picture"/>
+                    <pic:cNvPr descr="diagrams/modules.png" id="52" name="Picture"/>
                     <pic:cNvPicPr>
                       <a:picLocks noChangeArrowheads="1" noChangeAspect="1"/>
                     </pic:cNvPicPr>
                   </pic:nvPicPr>
                   <pic:blipFill>
-                    <a:blip r:embed="rId48"/>
+                    <a:blip r:embed="rId50"/>
                     <a:stretch>
                       <a:fillRect/>
                     </a:stretch>
@@ -6992,8 +7326,8 @@
         <w:t xml:space="preserve">Kernel, and the modules that are on for cashew or left for later</w:t>
       </w:r>
     </w:p>
-    <w:bookmarkEnd w:id="51"/>
-    <w:bookmarkStart w:id="59" w:name="mvp-roadmap"/>
+    <w:bookmarkEnd w:id="53"/>
+    <w:bookmarkStart w:id="61" w:name="mvp-roadmap"/>
     <w:p>
       <w:pPr>
         <w:pStyle w:val="Heading1"/>
@@ -7011,7 +7345,7 @@
         <w:t xml:space="preserve">Phases are sequential. A phase is done when its exit checks pass, not when the screens exist. Dates wait until a pilot coop and a plant are named.</w:t>
       </w:r>
     </w:p>
-    <w:bookmarkStart w:id="52" w:name="phase-1-parcel-and-harvest"/>
+    <w:bookmarkStart w:id="54" w:name="phase-1-parcel-and-harvest"/>
     <w:p>
       <w:pPr>
         <w:pStyle w:val="Heading2"/>
@@ -7204,8 +7538,8 @@
         <w:t xml:space="preserve">, appended in the same transaction. A rolled-back write leaves no leaf behind.</w:t>
       </w:r>
     </w:p>
-    <w:bookmarkEnd w:id="52"/>
-    <w:bookmarkStart w:id="53" w:name="phase-2-named-merges"/>
+    <w:bookmarkEnd w:id="54"/>
+    <w:bookmarkStart w:id="55" w:name="phase-2-named-merges"/>
     <w:p>
       <w:pPr>
         <w:pStyle w:val="Heading2"/>
@@ -7341,8 +7675,8 @@
         <w:t xml:space="preserve">The cashew profile rejects a mixed-origin merge. The test fixture uses Côte d’Ivoire. The merge code does not.</w:t>
       </w:r>
     </w:p>
-    <w:bookmarkEnd w:id="53"/>
-    <w:bookmarkStart w:id="54" w:name="phase-3-handoff-load-and-process"/>
+    <w:bookmarkEnd w:id="55"/>
+    <w:bookmarkStart w:id="56" w:name="phase-3-handoff-load-and-process"/>
     <w:p>
       <w:pPr>
         <w:pStyle w:val="Heading2"/>
@@ -7493,8 +7827,8 @@
         <w:t xml:space="preserve">.</w:t>
       </w:r>
     </w:p>
-    <w:bookmarkEnd w:id="54"/>
-    <w:bookmarkStart w:id="55" w:name="phase-4-pack-and-claim"/>
+    <w:bookmarkEnd w:id="56"/>
+    <w:bookmarkStart w:id="57" w:name="phase-4-pack-and-claim"/>
     <w:p>
       <w:pPr>
         <w:pStyle w:val="Heading2"/>
@@ -7615,8 +7949,8 @@
         <w:t xml:space="preserve">.</w:t>
       </w:r>
     </w:p>
-    <w:bookmarkEnd w:id="55"/>
-    <w:bookmarkStart w:id="56" w:name="phase-5-authority-and-audit"/>
+    <w:bookmarkEnd w:id="57"/>
+    <w:bookmarkStart w:id="58" w:name="phase-5-authority-and-audit"/>
     <w:p>
       <w:pPr>
         <w:pStyle w:val="Heading2"/>
@@ -7686,11 +8020,104 @@
         </w:numPr>
       </w:pPr>
       <w:r>
+        <w:t xml:space="preserve">An auditor resolves an alert. The alert stays visible with a signer, a reason, and a time, and the event that raised it is untouched. The public claim returns to</w:t>
+      </w:r>
+      <w:r>
+        <w:t xml:space="preserve"> </w:t>
+      </w:r>
+      <w:r>
+        <w:rPr>
+          <w:rStyle w:val="VerbatimChar"/>
+        </w:rPr>
+        <w:t xml:space="preserve">clear</w:t>
+      </w:r>
+      <w:r>
+        <w:t xml:space="preserve"> </w:t>
+      </w:r>
+      <w:r>
+        <w:t xml:space="preserve">and says the record was reviewed.</w:t>
+      </w:r>
+    </w:p>
+    <w:p>
+      <w:pPr>
+        <w:pStyle w:val="Compact"/>
+        <w:numPr>
+          <w:ilvl w:val="0"/>
+          <w:numId w:val="1011"/>
+        </w:numPr>
+      </w:pPr>
+      <w:r>
+        <w:t xml:space="preserve">The organization whose event raised an alert cannot resolve it.</w:t>
+      </w:r>
+    </w:p>
+    <w:p>
+      <w:pPr>
+        <w:pStyle w:val="Compact"/>
+        <w:numPr>
+          <w:ilvl w:val="0"/>
+          <w:numId w:val="1011"/>
+        </w:numPr>
+      </w:pPr>
+      <w:r>
+        <w:t xml:space="preserve">Turning on</w:t>
+      </w:r>
+      <w:r>
+        <w:t xml:space="preserve"> </w:t>
+      </w:r>
+      <w:r>
+        <w:rPr>
+          <w:rStyle w:val="VerbatimChar"/>
+        </w:rPr>
+        <w:t xml:space="preserve">countersign_required</w:t>
+      </w:r>
+      <w:r>
+        <w:t xml:space="preserve"> </w:t>
+      </w:r>
+      <w:r>
+        <w:t xml:space="preserve">for one event type in a test profile puts that lot’s claim at</w:t>
+      </w:r>
+      <w:r>
+        <w:t xml:space="preserve"> </w:t>
+      </w:r>
+      <w:r>
+        <w:rPr>
+          <w:rStyle w:val="VerbatimChar"/>
+        </w:rPr>
+        <w:t xml:space="preserve">awaiting countersign</w:t>
+      </w:r>
+      <w:r>
+        <w:t xml:space="preserve"> </w:t>
+      </w:r>
+      <w:r>
+        <w:t xml:space="preserve">and no reader sees</w:t>
+      </w:r>
+      <w:r>
+        <w:t xml:space="preserve"> </w:t>
+      </w:r>
+      <w:r>
+        <w:rPr>
+          <w:rStyle w:val="VerbatimChar"/>
+        </w:rPr>
+        <w:t xml:space="preserve">clear</w:t>
+      </w:r>
+      <w:r>
+        <w:t xml:space="preserve">. No migration is needed to do it.</w:t>
+      </w:r>
+    </w:p>
+    <w:p>
+      <w:pPr>
+        <w:pStyle w:val="Compact"/>
+        <w:numPr>
+          <w:ilvl w:val="0"/>
+          <w:numId w:val="1011"/>
+        </w:numPr>
+      </w:pPr>
+      <w:r>
         <w:t xml:space="preserve">A buyer sees the claim, the last inspection result with its report hash, and the band, and only for lots transferred to that buyer.</w:t>
       </w:r>
     </w:p>
-    <w:bookmarkEnd w:id="56"/>
-    <w:bookmarkStart w:id="57" w:name="phase-6-proofs"/>
+    <w:bookmarkEnd w:id="58"/>
+    <w:bookmarkStart w:id="59" w:name="phase-6-proofs"/>
     <w:p>
       <w:pPr>
         <w:pStyle w:val="Heading2"/>
@@ -7843,8 +8270,8 @@
         <w:t xml:space="preserve">The raw proof stays reachable for an auditor or a government that wants to recompute it.</w:t>
       </w:r>
     </w:p>
-    <w:bookmarkEnd w:id="57"/>
-    <w:bookmarkStart w:id="58" w:name="after-the-mvp"/>
+    <w:bookmarkEnd w:id="59"/>
+    <w:bookmarkStart w:id="60" w:name="after-the-mvp"/>
     <w:p>
       <w:pPr>
         <w:pStyle w:val="Heading2"/>
@@ -7969,9 +8396,9 @@
         <w:t xml:space="preserve">A permissioned ledger for the hash chain, if a second operator refuses this database. The event JSON and the leaf definition stay the same so the log can move.</w:t>
       </w:r>
     </w:p>
-    <w:bookmarkEnd w:id="58"/>
-    <w:bookmarkEnd w:id="59"/>
-    <w:bookmarkStart w:id="60" w:name="out-of-scope"/>
+    <w:bookmarkEnd w:id="60"/>
+    <w:bookmarkEnd w:id="61"/>
+    <w:bookmarkStart w:id="62" w:name="out-of-scope"/>
     <w:p>
       <w:pPr>
         <w:pStyle w:val="Heading1"/>
@@ -8064,8 +8491,8 @@
         <w:t xml:space="preserve">Multi-region deployment and a mobile app.</w:t>
       </w:r>
     </w:p>
-    <w:bookmarkEnd w:id="60"/>
-    <w:bookmarkStart w:id="61" w:name="how-this-stays-honest"/>
+    <w:bookmarkEnd w:id="62"/>
+    <w:bookmarkStart w:id="63" w:name="how-this-stays-honest"/>
     <w:p>
       <w:pPr>
         <w:pStyle w:val="Heading1"/>
@@ -8090,7 +8517,7 @@
         <w:t xml:space="preserve">It is not a claim that a cartel is inside the database. When an alert fires, the trail leaves this system and goes to people who investigate companies and accounts.</w:t>
       </w:r>
     </w:p>
-    <w:bookmarkEnd w:id="61"/>
+    <w:bookmarkEnd w:id="63"/>
     <w:sectPr>
       <w:footnotePr>
         <w:numRestart w:val="eachSect"/>

</xml_diff>